<commit_message>
Add QMessageBox, pvk cycle, min-max year calc, p for isp calc.
</commit_message>
<xml_diff>
--- a/Плейсхолдеры_шаблона.docx
+++ b/Плейсхолдеры_шаблона.docx
@@ -1,24 +1,11 @@
 
 <file path=word/document.xml><?xml version="1.0" encoding="utf-8"?>
-<w:document xmlns:wpc="http://schemas.microsoft.com/office/word/2010/wordprocessingCanvas" xmlns:cx="http://schemas.microsoft.com/office/drawing/2014/chartex" xmlns:mc="http://schemas.openxmlformats.org/markup-compatibility/2006" xmlns:o="urn:schemas-microsoft-com:office:office" xmlns:r="http://schemas.openxmlformats.org/officeDocument/2006/relationships" xmlns:m="http://schemas.openxmlformats.org/officeDocument/2006/math" xmlns:v="urn:schemas-microsoft-com:vml" xmlns:wp14="http://schemas.microsoft.com/office/word/2010/wordprocessingDrawing" xmlns:wp="http://schemas.openxmlformats.org/drawingml/2006/wordprocessingDrawing" xmlns:w10="urn:schemas-microsoft-com:office:word" xmlns:w="http://schemas.openxmlformats.org/wordprocessingml/2006/main" xmlns:w14="http://schemas.microsoft.com/office/word/2010/wordml" xmlns:w15="http://schemas.microsoft.com/office/word/2012/wordml" xmlns:w16se="http://schemas.microsoft.com/office/word/2015/wordml/symex" xmlns:wpg="http://schemas.microsoft.com/office/word/2010/wordprocessingGroup" xmlns:wpi="http://schemas.microsoft.com/office/word/2010/wordprocessingInk" xmlns:wne="http://schemas.microsoft.com/office/word/2006/wordml" xmlns:wps="http://schemas.microsoft.com/office/word/2010/wordprocessingShape" mc:Ignorable="w14 w15 w16se wp14">
+<w:document xmlns:wpc="http://schemas.microsoft.com/office/word/2010/wordprocessingCanvas" xmlns:cx="http://schemas.microsoft.com/office/drawing/2014/chartex" xmlns:cx1="http://schemas.microsoft.com/office/drawing/2015/9/8/chartex" xmlns:cx2="http://schemas.microsoft.com/office/drawing/2015/10/21/chartex" xmlns:cx3="http://schemas.microsoft.com/office/drawing/2016/5/9/chartex" xmlns:cx4="http://schemas.microsoft.com/office/drawing/2016/5/10/chartex" xmlns:cx5="http://schemas.microsoft.com/office/drawing/2016/5/11/chartex" xmlns:cx6="http://schemas.microsoft.com/office/drawing/2016/5/12/chartex" xmlns:cx7="http://schemas.microsoft.com/office/drawing/2016/5/13/chartex" xmlns:cx8="http://schemas.microsoft.com/office/drawing/2016/5/14/chartex" xmlns:mc="http://schemas.openxmlformats.org/markup-compatibility/2006" xmlns:aink="http://schemas.microsoft.com/office/drawing/2016/ink" xmlns:am3d="http://schemas.microsoft.com/office/drawing/2017/model3d" xmlns:o="urn:schemas-microsoft-com:office:office" xmlns:r="http://schemas.openxmlformats.org/officeDocument/2006/relationships" xmlns:m="http://schemas.openxmlformats.org/officeDocument/2006/math" xmlns:v="urn:schemas-microsoft-com:vml" xmlns:wp14="http://schemas.microsoft.com/office/word/2010/wordprocessingDrawing" xmlns:wp="http://schemas.openxmlformats.org/drawingml/2006/wordprocessingDrawing" xmlns:w10="urn:schemas-microsoft-com:office:word" xmlns:w="http://schemas.openxmlformats.org/wordprocessingml/2006/main" xmlns:w14="http://schemas.microsoft.com/office/word/2010/wordml" xmlns:w15="http://schemas.microsoft.com/office/word/2012/wordml" xmlns:w16cex="http://schemas.microsoft.com/office/word/2018/wordml/cex" xmlns:w16cid="http://schemas.microsoft.com/office/word/2016/wordml/cid" xmlns:w16="http://schemas.microsoft.com/office/word/2018/wordml" xmlns:w16se="http://schemas.microsoft.com/office/word/2015/wordml/symex" xmlns:wpg="http://schemas.microsoft.com/office/word/2010/wordprocessingGroup" xmlns:wpi="http://schemas.microsoft.com/office/word/2010/wordprocessingInk" xmlns:wne="http://schemas.microsoft.com/office/word/2006/wordml" xmlns:wps="http://schemas.microsoft.com/office/word/2010/wordprocessingShape" mc:Ignorable="w14 w15 w16se w16cid w16 w16cex wp14">
   <w:body>
     <w:p>
       <w:r>
-        <w:t xml:space="preserve">Таблица </w:t>
+        <w:t>Таблица плейсхолдеров для шаблона закла</w:t>
       </w:r>
-      <w:proofErr w:type="spellStart"/>
-      <w:r>
-        <w:t>плейсхолдеров</w:t>
-      </w:r>
-      <w:proofErr w:type="spellEnd"/>
-      <w:r>
-        <w:t xml:space="preserve"> для шаблона </w:t>
-      </w:r>
-      <w:proofErr w:type="spellStart"/>
-      <w:r>
-        <w:t>закла</w:t>
-      </w:r>
-      <w:proofErr w:type="spellEnd"/>
     </w:p>
     <w:p/>
     <w:tbl>
@@ -42,11 +29,9 @@
                 <w:highlight w:val="yellow"/>
               </w:rPr>
             </w:pPr>
-            <w:proofErr w:type="spellStart"/>
             <w:r>
               <w:t>Плейсхолдер</w:t>
             </w:r>
-            <w:proofErr w:type="spellEnd"/>
           </w:p>
         </w:tc>
         <w:tc>
@@ -77,17 +62,699 @@
                 <w:highlight w:val="yellow"/>
                 <w:lang w:val="en-US"/>
               </w:rPr>
-              <w:t xml:space="preserve">{{ </w:t>
-            </w:r>
-            <w:proofErr w:type="spellStart"/>
-            <w:r>
-              <w:rPr>
-                <w:highlight w:val="yellow"/>
-                <w:lang w:val="en-US"/>
-              </w:rPr>
-              <w:t>zakl_number</w:t>
-            </w:r>
-            <w:proofErr w:type="spellEnd"/>
+              <w:t>{{ zakl_number }}</w:t>
+            </w:r>
+          </w:p>
+        </w:tc>
+        <w:tc>
+          <w:tcPr>
+            <w:tcW w:w="5341" w:type="dxa"/>
+          </w:tcPr>
+          <w:p>
+            <w:r>
+              <w:t>Номер закла.</w:t>
+            </w:r>
+          </w:p>
+        </w:tc>
+      </w:tr>
+      <w:tr>
+        <w:tc>
+          <w:tcPr>
+            <w:tcW w:w="5341" w:type="dxa"/>
+          </w:tcPr>
+          <w:p>
+            <w:pPr>
+              <w:rPr>
+                <w:highlight w:val="yellow"/>
+                <w:lang w:val="en-US"/>
+              </w:rPr>
+            </w:pPr>
+            <w:r>
+              <w:rPr>
+                <w:highlight w:val="yellow"/>
+                <w:lang w:val="en-US"/>
+              </w:rPr>
+              <w:t>{{ reg_number }}</w:t>
+            </w:r>
+          </w:p>
+        </w:tc>
+        <w:tc>
+          <w:tcPr>
+            <w:tcW w:w="5341" w:type="dxa"/>
+          </w:tcPr>
+          <w:p>
+            <w:r>
+              <w:t>Рег секции.</w:t>
+            </w:r>
+          </w:p>
+        </w:tc>
+      </w:tr>
+      <w:tr>
+        <w:tc>
+          <w:tcPr>
+            <w:tcW w:w="5341" w:type="dxa"/>
+          </w:tcPr>
+          <w:p>
+            <w:pPr>
+              <w:rPr>
+                <w:highlight w:val="yellow"/>
+                <w:lang w:val="en-US"/>
+              </w:rPr>
+            </w:pPr>
+            <w:r>
+              <w:rPr>
+                <w:highlight w:val="yellow"/>
+                <w:lang w:val="en-US"/>
+              </w:rPr>
+              <w:t>{{ gost }}</w:t>
+            </w:r>
+          </w:p>
+        </w:tc>
+        <w:tc>
+          <w:tcPr>
+            <w:tcW w:w="5341" w:type="dxa"/>
+          </w:tcPr>
+          <w:p>
+            <w:r>
+              <w:t>Гост</w:t>
+            </w:r>
+            <w:r>
+              <w:t xml:space="preserve"> на изготовление.</w:t>
+            </w:r>
+          </w:p>
+        </w:tc>
+      </w:tr>
+      <w:tr>
+        <w:tc>
+          <w:tcPr>
+            <w:tcW w:w="5341" w:type="dxa"/>
+          </w:tcPr>
+          <w:p>
+            <w:pPr>
+              <w:rPr>
+                <w:highlight w:val="yellow"/>
+                <w:lang w:val="en-US"/>
+              </w:rPr>
+            </w:pPr>
+            <w:r>
+              <w:rPr>
+                <w:highlight w:val="yellow"/>
+                <w:lang w:val="en-US"/>
+              </w:rPr>
+              <w:t>{{ g_vvod }}</w:t>
+            </w:r>
+          </w:p>
+        </w:tc>
+        <w:tc>
+          <w:tcPr>
+            <w:tcW w:w="5341" w:type="dxa"/>
+          </w:tcPr>
+          <w:p>
+            <w:r>
+              <w:t>Дата ввода в экспл.</w:t>
+            </w:r>
+          </w:p>
+        </w:tc>
+      </w:tr>
+      <w:tr>
+        <w:tc>
+          <w:tcPr>
+            <w:tcW w:w="5341" w:type="dxa"/>
+          </w:tcPr>
+          <w:p>
+            <w:pPr>
+              <w:rPr>
+                <w:highlight w:val="yellow"/>
+                <w:lang w:val="en-US"/>
+              </w:rPr>
+            </w:pPr>
+            <w:r>
+              <w:rPr>
+                <w:highlight w:val="yellow"/>
+                <w:lang w:val="en-US"/>
+              </w:rPr>
+              <w:t>{{ dataZakl }}</w:t>
+            </w:r>
+          </w:p>
+        </w:tc>
+        <w:tc>
+          <w:tcPr>
+            <w:tcW w:w="5341" w:type="dxa"/>
+          </w:tcPr>
+          <w:p>
+            <w:r>
+              <w:t>Дата подписания закла???</w:t>
+            </w:r>
+          </w:p>
+        </w:tc>
+      </w:tr>
+      <w:tr>
+        <w:tc>
+          <w:tcPr>
+            <w:tcW w:w="5341" w:type="dxa"/>
+          </w:tcPr>
+          <w:p>
+            <w:pPr>
+              <w:rPr>
+                <w:highlight w:val="yellow"/>
+                <w:lang w:val="en-US"/>
+              </w:rPr>
+            </w:pPr>
+            <w:r>
+              <w:rPr>
+                <w:highlight w:val="yellow"/>
+                <w:lang w:val="en-US"/>
+              </w:rPr>
+              <w:t>{{ yearsOfExpluatation }}</w:t>
+            </w:r>
+          </w:p>
+        </w:tc>
+        <w:tc>
+          <w:tcPr>
+            <w:tcW w:w="5341" w:type="dxa"/>
+          </w:tcPr>
+          <w:p>
+            <w:r>
+              <w:t>Срок эксплуатации в годах.</w:t>
+            </w:r>
+          </w:p>
+        </w:tc>
+      </w:tr>
+      <w:tr>
+        <w:tc>
+          <w:tcPr>
+            <w:tcW w:w="5341" w:type="dxa"/>
+          </w:tcPr>
+          <w:p>
+            <w:pPr>
+              <w:rPr>
+                <w:highlight w:val="yellow"/>
+                <w:lang w:val="en-US"/>
+              </w:rPr>
+            </w:pPr>
+            <w:r>
+              <w:rPr>
+                <w:highlight w:val="yellow"/>
+                <w:lang w:val="en-US"/>
+              </w:rPr>
+              <w:t>{{ min_year }}</w:t>
+            </w:r>
+          </w:p>
+        </w:tc>
+        <w:tc>
+          <w:tcPr>
+            <w:tcW w:w="5341" w:type="dxa"/>
+          </w:tcPr>
+          <w:p>
+            <w:r>
+              <w:t>Минимальный год изготовления.</w:t>
+            </w:r>
+          </w:p>
+        </w:tc>
+      </w:tr>
+      <w:tr>
+        <w:tc>
+          <w:tcPr>
+            <w:tcW w:w="5341" w:type="dxa"/>
+          </w:tcPr>
+          <w:p>
+            <w:pPr>
+              <w:rPr>
+                <w:highlight w:val="yellow"/>
+                <w:lang w:val="en-US"/>
+              </w:rPr>
+            </w:pPr>
+            <w:r>
+              <w:rPr>
+                <w:highlight w:val="yellow"/>
+                <w:lang w:val="en-US"/>
+              </w:rPr>
+              <w:t>{{ max_year }}</w:t>
+            </w:r>
+          </w:p>
+        </w:tc>
+        <w:tc>
+          <w:tcPr>
+            <w:tcW w:w="5341" w:type="dxa"/>
+          </w:tcPr>
+          <w:p>
+            <w:r>
+              <w:t>Максимальный год изготовления.</w:t>
+            </w:r>
+          </w:p>
+        </w:tc>
+      </w:tr>
+      <w:tr>
+        <w:tc>
+          <w:tcPr>
+            <w:tcW w:w="5341" w:type="dxa"/>
+          </w:tcPr>
+          <w:p>
+            <w:pPr>
+              <w:rPr>
+                <w:highlight w:val="yellow"/>
+                <w:lang w:val="en-US"/>
+              </w:rPr>
+            </w:pPr>
+            <w:r>
+              <w:rPr>
+                <w:highlight w:val="yellow"/>
+                <w:lang w:val="en-US"/>
+              </w:rPr>
+              <w:t>{{ chertezh }}</w:t>
+            </w:r>
+          </w:p>
+        </w:tc>
+        <w:tc>
+          <w:tcPr>
+            <w:tcW w:w="5341" w:type="dxa"/>
+          </w:tcPr>
+          <w:p>
+            <w:pPr>
+              <w:rPr>
+                <w:lang w:val="en-US"/>
+              </w:rPr>
+            </w:pPr>
+            <w:r>
+              <w:t>Чертёж.</w:t>
+            </w:r>
+          </w:p>
+        </w:tc>
+      </w:tr>
+      <w:tr>
+        <w:tc>
+          <w:tcPr>
+            <w:tcW w:w="5341" w:type="dxa"/>
+          </w:tcPr>
+          <w:p>
+            <w:pPr>
+              <w:rPr>
+                <w:highlight w:val="yellow"/>
+                <w:lang w:val="en-US"/>
+              </w:rPr>
+            </w:pPr>
+            <w:r>
+              <w:rPr>
+                <w:highlight w:val="yellow"/>
+                <w:lang w:val="en-US"/>
+              </w:rPr>
+              <w:t>{{ p_rasch }}</w:t>
+            </w:r>
+          </w:p>
+        </w:tc>
+        <w:tc>
+          <w:tcPr>
+            <w:tcW w:w="5341" w:type="dxa"/>
+          </w:tcPr>
+          <w:p>
+            <w:r>
+              <w:t>Давление расчётное.</w:t>
+            </w:r>
+          </w:p>
+        </w:tc>
+      </w:tr>
+      <w:tr>
+        <w:tc>
+          <w:tcPr>
+            <w:tcW w:w="5341" w:type="dxa"/>
+          </w:tcPr>
+          <w:p>
+            <w:pPr>
+              <w:rPr>
+                <w:highlight w:val="yellow"/>
+                <w:lang w:val="en-US"/>
+              </w:rPr>
+            </w:pPr>
+            <w:r>
+              <w:rPr>
+                <w:highlight w:val="yellow"/>
+                <w:lang w:val="en-US"/>
+              </w:rPr>
+              <w:t>{{ p_rab }}</w:t>
+            </w:r>
+          </w:p>
+        </w:tc>
+        <w:tc>
+          <w:tcPr>
+            <w:tcW w:w="5341" w:type="dxa"/>
+          </w:tcPr>
+          <w:p>
+            <w:r>
+              <w:t>Давление рабочее.</w:t>
+            </w:r>
+          </w:p>
+        </w:tc>
+      </w:tr>
+      <w:tr>
+        <w:tc>
+          <w:tcPr>
+            <w:tcW w:w="5341" w:type="dxa"/>
+          </w:tcPr>
+          <w:p>
+            <w:pPr>
+              <w:rPr>
+                <w:highlight w:val="yellow"/>
+                <w:lang w:val="en-US"/>
+              </w:rPr>
+            </w:pPr>
+            <w:r>
+              <w:rPr>
+                <w:highlight w:val="yellow"/>
+                <w:lang w:val="en-US"/>
+              </w:rPr>
+              <w:t>{{ p_rab_025 }}</w:t>
+            </w:r>
+          </w:p>
+        </w:tc>
+        <w:tc>
+          <w:tcPr>
+            <w:tcW w:w="5341" w:type="dxa"/>
+          </w:tcPr>
+          <w:p>
+            <w:pPr>
+              <w:tabs>
+                <w:tab w:val="left" w:pos="3090"/>
+              </w:tabs>
+            </w:pPr>
+            <w:r>
+              <w:rPr>
+                <w:lang w:val="en-US"/>
+              </w:rPr>
+              <w:t xml:space="preserve">0.25 </w:t>
+            </w:r>
+            <w:r>
+              <w:t>рабочего давления.</w:t>
+            </w:r>
+          </w:p>
+        </w:tc>
+      </w:tr>
+      <w:tr>
+        <w:tc>
+          <w:tcPr>
+            <w:tcW w:w="5341" w:type="dxa"/>
+          </w:tcPr>
+          <w:p>
+            <w:pPr>
+              <w:rPr>
+                <w:highlight w:val="yellow"/>
+                <w:lang w:val="en-US"/>
+              </w:rPr>
+            </w:pPr>
+            <w:r>
+              <w:rPr>
+                <w:highlight w:val="yellow"/>
+                <w:lang w:val="en-US"/>
+              </w:rPr>
+              <w:t>{{ p_rab_05 }}</w:t>
+            </w:r>
+          </w:p>
+        </w:tc>
+        <w:tc>
+          <w:tcPr>
+            <w:tcW w:w="5341" w:type="dxa"/>
+          </w:tcPr>
+          <w:p>
+            <w:pPr>
+              <w:tabs>
+                <w:tab w:val="left" w:pos="3090"/>
+              </w:tabs>
+              <w:rPr>
+                <w:lang w:val="en-US"/>
+              </w:rPr>
+            </w:pPr>
+            <w:r>
+              <w:rPr>
+                <w:lang w:val="en-US"/>
+              </w:rPr>
+              <w:t xml:space="preserve">0.5 </w:t>
+            </w:r>
+            <w:r>
+              <w:t>рабочего давления.</w:t>
+            </w:r>
+          </w:p>
+        </w:tc>
+      </w:tr>
+      <w:tr>
+        <w:tc>
+          <w:tcPr>
+            <w:tcW w:w="5341" w:type="dxa"/>
+          </w:tcPr>
+          <w:p>
+            <w:pPr>
+              <w:rPr>
+                <w:highlight w:val="yellow"/>
+                <w:lang w:val="en-US"/>
+              </w:rPr>
+            </w:pPr>
+            <w:r>
+              <w:rPr>
+                <w:highlight w:val="yellow"/>
+                <w:lang w:val="en-US"/>
+              </w:rPr>
+              <w:t>{{ p_rab_075 }}</w:t>
+            </w:r>
+          </w:p>
+        </w:tc>
+        <w:tc>
+          <w:tcPr>
+            <w:tcW w:w="5341" w:type="dxa"/>
+          </w:tcPr>
+          <w:p>
+            <w:pPr>
+              <w:tabs>
+                <w:tab w:val="left" w:pos="3090"/>
+              </w:tabs>
+            </w:pPr>
+            <w:r>
+              <w:rPr>
+                <w:lang w:val="en-US"/>
+              </w:rPr>
+              <w:t xml:space="preserve">0.75 </w:t>
+            </w:r>
+            <w:r>
+              <w:t>рабочего давления.</w:t>
+            </w:r>
+          </w:p>
+        </w:tc>
+      </w:tr>
+      <w:tr>
+        <w:tc>
+          <w:tcPr>
+            <w:tcW w:w="5341" w:type="dxa"/>
+          </w:tcPr>
+          <w:p>
+            <w:pPr>
+              <w:rPr>
+                <w:highlight w:val="yellow"/>
+                <w:lang w:val="en-US"/>
+              </w:rPr>
+            </w:pPr>
+            <w:r>
+              <w:rPr>
+                <w:highlight w:val="yellow"/>
+                <w:lang w:val="en-US"/>
+              </w:rPr>
+              <w:t>{{ s_isp }}</w:t>
+            </w:r>
+          </w:p>
+        </w:tc>
+        <w:tc>
+          <w:tcPr>
+            <w:tcW w:w="5341" w:type="dxa"/>
+          </w:tcPr>
+          <w:p>
+            <w:r>
+              <w:t>Исполнительная толщина.(паспорт.).</w:t>
+            </w:r>
+          </w:p>
+        </w:tc>
+      </w:tr>
+      <w:tr>
+        <w:tc>
+          <w:tcPr>
+            <w:tcW w:w="5341" w:type="dxa"/>
+          </w:tcPr>
+          <w:p>
+            <w:pPr>
+              <w:rPr>
+                <w:highlight w:val="yellow"/>
+                <w:lang w:val="en-US"/>
+              </w:rPr>
+            </w:pPr>
+            <w:r>
+              <w:rPr>
+                <w:highlight w:val="yellow"/>
+                <w:lang w:val="en-US"/>
+              </w:rPr>
+              <w:t>{{ length }}</w:t>
+            </w:r>
+          </w:p>
+        </w:tc>
+        <w:tc>
+          <w:tcPr>
+            <w:tcW w:w="5341" w:type="dxa"/>
+          </w:tcPr>
+          <w:p>
+            <w:r>
+              <w:t>Длина баллона.</w:t>
+            </w:r>
+          </w:p>
+        </w:tc>
+      </w:tr>
+      <w:tr>
+        <w:tc>
+          <w:tcPr>
+            <w:tcW w:w="5341" w:type="dxa"/>
+          </w:tcPr>
+          <w:p>
+            <w:pPr>
+              <w:rPr>
+                <w:highlight w:val="yellow"/>
+                <w:lang w:val="en-US"/>
+              </w:rPr>
+            </w:pPr>
+            <w:r>
+              <w:rPr>
+                <w:highlight w:val="yellow"/>
+                <w:lang w:val="en-US"/>
+              </w:rPr>
+              <w:t>{{ d_nar }}</w:t>
+            </w:r>
+          </w:p>
+        </w:tc>
+        <w:tc>
+          <w:tcPr>
+            <w:tcW w:w="5341" w:type="dxa"/>
+          </w:tcPr>
+          <w:p>
+            <w:r>
+              <w:t>Диаметр наружный.</w:t>
+            </w:r>
+          </w:p>
+        </w:tc>
+      </w:tr>
+      <w:tr>
+        <w:tc>
+          <w:tcPr>
+            <w:tcW w:w="5341" w:type="dxa"/>
+          </w:tcPr>
+          <w:p>
+            <w:pPr>
+              <w:rPr>
+                <w:highlight w:val="yellow"/>
+                <w:lang w:val="en-US"/>
+              </w:rPr>
+            </w:pPr>
+            <w:r>
+              <w:rPr>
+                <w:highlight w:val="yellow"/>
+                <w:lang w:val="en-US"/>
+              </w:rPr>
+              <w:t>{{ d_min }}</w:t>
+            </w:r>
+          </w:p>
+        </w:tc>
+        <w:tc>
+          <w:tcPr>
+            <w:tcW w:w="5341" w:type="dxa"/>
+          </w:tcPr>
+          <w:p>
+            <w:r>
+              <w:t>Мин диаметр.</w:t>
+            </w:r>
+          </w:p>
+        </w:tc>
+      </w:tr>
+      <w:tr>
+        <w:tc>
+          <w:tcPr>
+            <w:tcW w:w="5341" w:type="dxa"/>
+          </w:tcPr>
+          <w:p>
+            <w:pPr>
+              <w:rPr>
+                <w:highlight w:val="yellow"/>
+                <w:lang w:val="en-US"/>
+              </w:rPr>
+            </w:pPr>
+            <w:r>
+              <w:rPr>
+                <w:highlight w:val="yellow"/>
+                <w:lang w:val="en-US"/>
+              </w:rPr>
+              <w:t>{{ d_max }}</w:t>
+            </w:r>
+          </w:p>
+        </w:tc>
+        <w:tc>
+          <w:tcPr>
+            <w:tcW w:w="5341" w:type="dxa"/>
+          </w:tcPr>
+          <w:p>
+            <w:r>
+              <w:t>Макс диаметр.</w:t>
+            </w:r>
+          </w:p>
+        </w:tc>
+      </w:tr>
+      <w:tr>
+        <w:tc>
+          <w:tcPr>
+            <w:tcW w:w="5341" w:type="dxa"/>
+          </w:tcPr>
+          <w:p>
+            <w:pPr>
+              <w:rPr>
+                <w:highlight w:val="yellow"/>
+                <w:lang w:val="en-US"/>
+              </w:rPr>
+            </w:pPr>
+            <w:r>
+              <w:rPr>
+                <w:highlight w:val="yellow"/>
+                <w:lang w:val="en-US"/>
+              </w:rPr>
+              <w:t>{{ volume }}</w:t>
+            </w:r>
+          </w:p>
+        </w:tc>
+        <w:tc>
+          <w:tcPr>
+            <w:tcW w:w="5341" w:type="dxa"/>
+          </w:tcPr>
+          <w:p>
+            <w:r>
+              <w:t>Объём.</w:t>
+            </w:r>
+          </w:p>
+        </w:tc>
+      </w:tr>
+      <w:tr>
+        <w:tc>
+          <w:tcPr>
+            <w:tcW w:w="5341" w:type="dxa"/>
+          </w:tcPr>
+          <w:p>
+            <w:pPr>
+              <w:rPr>
+                <w:highlight w:val="yellow"/>
+                <w:lang w:val="en-US"/>
+              </w:rPr>
+            </w:pPr>
+            <w:r>
+              <w:rPr>
+                <w:highlight w:val="yellow"/>
+                <w:lang w:val="en-US"/>
+              </w:rPr>
+              <w:t>{{</w:t>
+            </w:r>
+            <w:r>
+              <w:rPr>
+                <w:highlight w:val="yellow"/>
+                <w:lang w:val="en-US"/>
+              </w:rPr>
+              <w:t xml:space="preserve"> volume_total</w:t>
+            </w:r>
             <w:r>
               <w:rPr>
                 <w:highlight w:val="yellow"/>
@@ -103,735 +770,6 @@
           </w:tcPr>
           <w:p>
             <w:r>
-              <w:t xml:space="preserve">Номер </w:t>
-            </w:r>
-            <w:proofErr w:type="spellStart"/>
-            <w:r>
-              <w:t>закла</w:t>
-            </w:r>
-            <w:proofErr w:type="spellEnd"/>
-            <w:r>
-              <w:t>.</w:t>
-            </w:r>
-          </w:p>
-        </w:tc>
-      </w:tr>
-      <w:tr>
-        <w:tc>
-          <w:tcPr>
-            <w:tcW w:w="5341" w:type="dxa"/>
-          </w:tcPr>
-          <w:p>
-            <w:pPr>
-              <w:rPr>
-                <w:highlight w:val="yellow"/>
-                <w:lang w:val="en-US"/>
-              </w:rPr>
-            </w:pPr>
-            <w:r>
-              <w:rPr>
-                <w:highlight w:val="yellow"/>
-                <w:lang w:val="en-US"/>
-              </w:rPr>
-              <w:t xml:space="preserve">{{ </w:t>
-            </w:r>
-            <w:proofErr w:type="spellStart"/>
-            <w:r>
-              <w:rPr>
-                <w:highlight w:val="yellow"/>
-                <w:lang w:val="en-US"/>
-              </w:rPr>
-              <w:t>reg_number</w:t>
-            </w:r>
-            <w:proofErr w:type="spellEnd"/>
-            <w:r>
-              <w:rPr>
-                <w:highlight w:val="yellow"/>
-                <w:lang w:val="en-US"/>
-              </w:rPr>
-              <w:t xml:space="preserve"> }}</w:t>
-            </w:r>
-          </w:p>
-        </w:tc>
-        <w:tc>
-          <w:tcPr>
-            <w:tcW w:w="5341" w:type="dxa"/>
-          </w:tcPr>
-          <w:p>
-            <w:proofErr w:type="spellStart"/>
-            <w:r>
-              <w:t>Рег</w:t>
-            </w:r>
-            <w:proofErr w:type="spellEnd"/>
-            <w:r>
-              <w:t xml:space="preserve"> секции.</w:t>
-            </w:r>
-          </w:p>
-        </w:tc>
-      </w:tr>
-      <w:tr>
-        <w:tc>
-          <w:tcPr>
-            <w:tcW w:w="5341" w:type="dxa"/>
-          </w:tcPr>
-          <w:p>
-            <w:pPr>
-              <w:rPr>
-                <w:highlight w:val="yellow"/>
-                <w:lang w:val="en-US"/>
-              </w:rPr>
-            </w:pPr>
-            <w:r>
-              <w:rPr>
-                <w:highlight w:val="yellow"/>
-                <w:lang w:val="en-US"/>
-              </w:rPr>
-              <w:t xml:space="preserve">{{ </w:t>
-            </w:r>
-            <w:proofErr w:type="spellStart"/>
-            <w:r>
-              <w:rPr>
-                <w:highlight w:val="yellow"/>
-                <w:lang w:val="en-US"/>
-              </w:rPr>
-              <w:t>gost</w:t>
-            </w:r>
-            <w:proofErr w:type="spellEnd"/>
-            <w:r>
-              <w:rPr>
-                <w:highlight w:val="yellow"/>
-                <w:lang w:val="en-US"/>
-              </w:rPr>
-              <w:t xml:space="preserve"> }}</w:t>
-            </w:r>
-          </w:p>
-        </w:tc>
-        <w:tc>
-          <w:tcPr>
-            <w:tcW w:w="5341" w:type="dxa"/>
-          </w:tcPr>
-          <w:p>
-            <w:r>
-              <w:t>Гост.</w:t>
-            </w:r>
-          </w:p>
-        </w:tc>
-      </w:tr>
-      <w:tr>
-        <w:tc>
-          <w:tcPr>
-            <w:tcW w:w="5341" w:type="dxa"/>
-          </w:tcPr>
-          <w:p>
-            <w:pPr>
-              <w:rPr>
-                <w:highlight w:val="yellow"/>
-                <w:lang w:val="en-US"/>
-              </w:rPr>
-            </w:pPr>
-            <w:r>
-              <w:rPr>
-                <w:highlight w:val="yellow"/>
-                <w:lang w:val="en-US"/>
-              </w:rPr>
-              <w:t xml:space="preserve">{{ </w:t>
-            </w:r>
-            <w:proofErr w:type="spellStart"/>
-            <w:r>
-              <w:rPr>
-                <w:highlight w:val="yellow"/>
-                <w:lang w:val="en-US"/>
-              </w:rPr>
-              <w:t>g_vvod</w:t>
-            </w:r>
-            <w:proofErr w:type="spellEnd"/>
-            <w:r>
-              <w:rPr>
-                <w:highlight w:val="yellow"/>
-                <w:lang w:val="en-US"/>
-              </w:rPr>
-              <w:t xml:space="preserve"> }}</w:t>
-            </w:r>
-          </w:p>
-        </w:tc>
-        <w:tc>
-          <w:tcPr>
-            <w:tcW w:w="5341" w:type="dxa"/>
-          </w:tcPr>
-          <w:p>
-            <w:r>
-              <w:t xml:space="preserve">Дата ввода в </w:t>
-            </w:r>
-            <w:proofErr w:type="spellStart"/>
-            <w:r>
-              <w:t>экспл</w:t>
-            </w:r>
-            <w:proofErr w:type="spellEnd"/>
-            <w:r>
-              <w:t>.</w:t>
-            </w:r>
-          </w:p>
-        </w:tc>
-      </w:tr>
-      <w:tr>
-        <w:tc>
-          <w:tcPr>
-            <w:tcW w:w="5341" w:type="dxa"/>
-          </w:tcPr>
-          <w:p>
-            <w:pPr>
-              <w:rPr>
-                <w:highlight w:val="yellow"/>
-                <w:lang w:val="en-US"/>
-              </w:rPr>
-            </w:pPr>
-            <w:r>
-              <w:rPr>
-                <w:highlight w:val="yellow"/>
-                <w:lang w:val="en-US"/>
-              </w:rPr>
-              <w:t xml:space="preserve">{{ </w:t>
-            </w:r>
-            <w:proofErr w:type="spellStart"/>
-            <w:r>
-              <w:rPr>
-                <w:highlight w:val="yellow"/>
-                <w:lang w:val="en-US"/>
-              </w:rPr>
-              <w:t>dataZakl</w:t>
-            </w:r>
-            <w:proofErr w:type="spellEnd"/>
-            <w:r>
-              <w:rPr>
-                <w:highlight w:val="yellow"/>
-                <w:lang w:val="en-US"/>
-              </w:rPr>
-              <w:t xml:space="preserve"> }}</w:t>
-            </w:r>
-          </w:p>
-        </w:tc>
-        <w:tc>
-          <w:tcPr>
-            <w:tcW w:w="5341" w:type="dxa"/>
-          </w:tcPr>
-          <w:p>
-            <w:r>
-              <w:t xml:space="preserve">Дата подписания </w:t>
-            </w:r>
-            <w:proofErr w:type="spellStart"/>
-            <w:r>
-              <w:t>закла</w:t>
-            </w:r>
-            <w:proofErr w:type="spellEnd"/>
-            <w:r>
-              <w:t>???</w:t>
-            </w:r>
-          </w:p>
-        </w:tc>
-      </w:tr>
-      <w:tr>
-        <w:tc>
-          <w:tcPr>
-            <w:tcW w:w="5341" w:type="dxa"/>
-          </w:tcPr>
-          <w:p>
-            <w:pPr>
-              <w:rPr>
-                <w:highlight w:val="yellow"/>
-                <w:lang w:val="en-US"/>
-              </w:rPr>
-            </w:pPr>
-            <w:r>
-              <w:rPr>
-                <w:highlight w:val="yellow"/>
-                <w:lang w:val="en-US"/>
-              </w:rPr>
-              <w:t xml:space="preserve">{{ </w:t>
-            </w:r>
-            <w:proofErr w:type="spellStart"/>
-            <w:r>
-              <w:rPr>
-                <w:highlight w:val="yellow"/>
-                <w:lang w:val="en-US"/>
-              </w:rPr>
-              <w:t>yearsOfExpluatation</w:t>
-            </w:r>
-            <w:proofErr w:type="spellEnd"/>
-            <w:r>
-              <w:rPr>
-                <w:highlight w:val="yellow"/>
-                <w:lang w:val="en-US"/>
-              </w:rPr>
-              <w:t xml:space="preserve"> }}</w:t>
-            </w:r>
-          </w:p>
-        </w:tc>
-        <w:tc>
-          <w:tcPr>
-            <w:tcW w:w="5341" w:type="dxa"/>
-          </w:tcPr>
-          <w:p>
-            <w:r>
-              <w:t>Срок эксплуатации в годах.</w:t>
-            </w:r>
-          </w:p>
-        </w:tc>
-      </w:tr>
-      <w:tr>
-        <w:tc>
-          <w:tcPr>
-            <w:tcW w:w="5341" w:type="dxa"/>
-          </w:tcPr>
-          <w:p>
-            <w:pPr>
-              <w:rPr>
-                <w:highlight w:val="yellow"/>
-                <w:lang w:val="en-US"/>
-              </w:rPr>
-            </w:pPr>
-            <w:r>
-              <w:rPr>
-                <w:highlight w:val="yellow"/>
-                <w:lang w:val="en-US"/>
-              </w:rPr>
-              <w:t xml:space="preserve">{{ </w:t>
-            </w:r>
-            <w:proofErr w:type="spellStart"/>
-            <w:r>
-              <w:rPr>
-                <w:highlight w:val="yellow"/>
-                <w:lang w:val="en-US"/>
-              </w:rPr>
-              <w:t>chertezh</w:t>
-            </w:r>
-            <w:proofErr w:type="spellEnd"/>
-            <w:r>
-              <w:rPr>
-                <w:highlight w:val="yellow"/>
-                <w:lang w:val="en-US"/>
-              </w:rPr>
-              <w:t xml:space="preserve"> }}</w:t>
-            </w:r>
-          </w:p>
-        </w:tc>
-        <w:tc>
-          <w:tcPr>
-            <w:tcW w:w="5341" w:type="dxa"/>
-          </w:tcPr>
-          <w:p>
-            <w:pPr>
-              <w:rPr>
-                <w:lang w:val="en-US"/>
-              </w:rPr>
-            </w:pPr>
-            <w:r>
-              <w:t>Чертёж.</w:t>
-            </w:r>
-          </w:p>
-        </w:tc>
-      </w:tr>
-      <w:tr>
-        <w:tc>
-          <w:tcPr>
-            <w:tcW w:w="5341" w:type="dxa"/>
-          </w:tcPr>
-          <w:p>
-            <w:pPr>
-              <w:rPr>
-                <w:highlight w:val="yellow"/>
-                <w:lang w:val="en-US"/>
-              </w:rPr>
-            </w:pPr>
-            <w:r>
-              <w:rPr>
-                <w:highlight w:val="yellow"/>
-                <w:lang w:val="en-US"/>
-              </w:rPr>
-              <w:t xml:space="preserve">{{ </w:t>
-            </w:r>
-            <w:proofErr w:type="spellStart"/>
-            <w:r>
-              <w:rPr>
-                <w:highlight w:val="yellow"/>
-                <w:lang w:val="en-US"/>
-              </w:rPr>
-              <w:t>p_rasch</w:t>
-            </w:r>
-            <w:proofErr w:type="spellEnd"/>
-            <w:r>
-              <w:rPr>
-                <w:highlight w:val="yellow"/>
-                <w:lang w:val="en-US"/>
-              </w:rPr>
-              <w:t xml:space="preserve"> }}</w:t>
-            </w:r>
-          </w:p>
-        </w:tc>
-        <w:tc>
-          <w:tcPr>
-            <w:tcW w:w="5341" w:type="dxa"/>
-          </w:tcPr>
-          <w:p>
-            <w:r>
-              <w:t>Давление расчётное.</w:t>
-            </w:r>
-          </w:p>
-        </w:tc>
-      </w:tr>
-      <w:tr>
-        <w:tc>
-          <w:tcPr>
-            <w:tcW w:w="5341" w:type="dxa"/>
-          </w:tcPr>
-          <w:p>
-            <w:pPr>
-              <w:rPr>
-                <w:highlight w:val="yellow"/>
-                <w:lang w:val="en-US"/>
-              </w:rPr>
-            </w:pPr>
-            <w:r>
-              <w:rPr>
-                <w:highlight w:val="yellow"/>
-                <w:lang w:val="en-US"/>
-              </w:rPr>
-              <w:t xml:space="preserve">{{ </w:t>
-            </w:r>
-            <w:proofErr w:type="spellStart"/>
-            <w:r>
-              <w:rPr>
-                <w:highlight w:val="yellow"/>
-                <w:lang w:val="en-US"/>
-              </w:rPr>
-              <w:t>p_rab</w:t>
-            </w:r>
-            <w:proofErr w:type="spellEnd"/>
-            <w:r>
-              <w:rPr>
-                <w:highlight w:val="yellow"/>
-                <w:lang w:val="en-US"/>
-              </w:rPr>
-              <w:t xml:space="preserve"> }}</w:t>
-            </w:r>
-          </w:p>
-        </w:tc>
-        <w:tc>
-          <w:tcPr>
-            <w:tcW w:w="5341" w:type="dxa"/>
-          </w:tcPr>
-          <w:p>
-            <w:r>
-              <w:t>Давление рабочее.</w:t>
-            </w:r>
-          </w:p>
-        </w:tc>
-      </w:tr>
-      <w:tr>
-        <w:tc>
-          <w:tcPr>
-            <w:tcW w:w="5341" w:type="dxa"/>
-          </w:tcPr>
-          <w:p>
-            <w:pPr>
-              <w:rPr>
-                <w:highlight w:val="yellow"/>
-                <w:lang w:val="en-US"/>
-              </w:rPr>
-            </w:pPr>
-            <w:r>
-              <w:rPr>
-                <w:highlight w:val="yellow"/>
-                <w:lang w:val="en-US"/>
-              </w:rPr>
-              <w:t xml:space="preserve">{{ </w:t>
-            </w:r>
-            <w:proofErr w:type="spellStart"/>
-            <w:r>
-              <w:rPr>
-                <w:highlight w:val="yellow"/>
-                <w:lang w:val="en-US"/>
-              </w:rPr>
-              <w:t>s_isp</w:t>
-            </w:r>
-            <w:proofErr w:type="spellEnd"/>
-            <w:r>
-              <w:rPr>
-                <w:highlight w:val="yellow"/>
-                <w:lang w:val="en-US"/>
-              </w:rPr>
-              <w:t xml:space="preserve"> }}</w:t>
-            </w:r>
-          </w:p>
-        </w:tc>
-        <w:tc>
-          <w:tcPr>
-            <w:tcW w:w="5341" w:type="dxa"/>
-          </w:tcPr>
-          <w:p>
-            <w:r>
-              <w:t>Исполнительная толщина.(паспорт.).</w:t>
-            </w:r>
-          </w:p>
-        </w:tc>
-      </w:tr>
-      <w:tr>
-        <w:tc>
-          <w:tcPr>
-            <w:tcW w:w="5341" w:type="dxa"/>
-          </w:tcPr>
-          <w:p>
-            <w:pPr>
-              <w:rPr>
-                <w:highlight w:val="yellow"/>
-                <w:lang w:val="en-US"/>
-              </w:rPr>
-            </w:pPr>
-            <w:r>
-              <w:rPr>
-                <w:highlight w:val="yellow"/>
-                <w:lang w:val="en-US"/>
-              </w:rPr>
-              <w:t>{{ length }}</w:t>
-            </w:r>
-          </w:p>
-        </w:tc>
-        <w:tc>
-          <w:tcPr>
-            <w:tcW w:w="5341" w:type="dxa"/>
-          </w:tcPr>
-          <w:p>
-            <w:r>
-              <w:t>Длина баллона.</w:t>
-            </w:r>
-          </w:p>
-        </w:tc>
-      </w:tr>
-      <w:tr>
-        <w:tc>
-          <w:tcPr>
-            <w:tcW w:w="5341" w:type="dxa"/>
-          </w:tcPr>
-          <w:p>
-            <w:pPr>
-              <w:rPr>
-                <w:highlight w:val="yellow"/>
-                <w:lang w:val="en-US"/>
-              </w:rPr>
-            </w:pPr>
-            <w:r>
-              <w:rPr>
-                <w:highlight w:val="yellow"/>
-                <w:lang w:val="en-US"/>
-              </w:rPr>
-              <w:t xml:space="preserve">{{ </w:t>
-            </w:r>
-            <w:proofErr w:type="spellStart"/>
-            <w:r>
-              <w:rPr>
-                <w:highlight w:val="yellow"/>
-                <w:lang w:val="en-US"/>
-              </w:rPr>
-              <w:t>d_nar</w:t>
-            </w:r>
-            <w:proofErr w:type="spellEnd"/>
-            <w:r>
-              <w:rPr>
-                <w:highlight w:val="yellow"/>
-                <w:lang w:val="en-US"/>
-              </w:rPr>
-              <w:t xml:space="preserve"> }}</w:t>
-            </w:r>
-          </w:p>
-        </w:tc>
-        <w:tc>
-          <w:tcPr>
-            <w:tcW w:w="5341" w:type="dxa"/>
-          </w:tcPr>
-          <w:p>
-            <w:r>
-              <w:t>Диаметр наружный.</w:t>
-            </w:r>
-          </w:p>
-        </w:tc>
-      </w:tr>
-      <w:tr>
-        <w:tc>
-          <w:tcPr>
-            <w:tcW w:w="5341" w:type="dxa"/>
-          </w:tcPr>
-          <w:p>
-            <w:pPr>
-              <w:rPr>
-                <w:highlight w:val="yellow"/>
-                <w:lang w:val="en-US"/>
-              </w:rPr>
-            </w:pPr>
-            <w:r>
-              <w:rPr>
-                <w:highlight w:val="yellow"/>
-                <w:lang w:val="en-US"/>
-              </w:rPr>
-              <w:t xml:space="preserve">{{ </w:t>
-            </w:r>
-            <w:proofErr w:type="spellStart"/>
-            <w:r>
-              <w:rPr>
-                <w:highlight w:val="yellow"/>
-                <w:lang w:val="en-US"/>
-              </w:rPr>
-              <w:t>d_min</w:t>
-            </w:r>
-            <w:proofErr w:type="spellEnd"/>
-            <w:r>
-              <w:rPr>
-                <w:highlight w:val="yellow"/>
-                <w:lang w:val="en-US"/>
-              </w:rPr>
-              <w:t xml:space="preserve"> }}</w:t>
-            </w:r>
-          </w:p>
-        </w:tc>
-        <w:tc>
-          <w:tcPr>
-            <w:tcW w:w="5341" w:type="dxa"/>
-          </w:tcPr>
-          <w:p>
-            <w:r>
-              <w:t>Мин диаметр.</w:t>
-            </w:r>
-          </w:p>
-        </w:tc>
-      </w:tr>
-      <w:tr>
-        <w:tc>
-          <w:tcPr>
-            <w:tcW w:w="5341" w:type="dxa"/>
-          </w:tcPr>
-          <w:p>
-            <w:pPr>
-              <w:rPr>
-                <w:highlight w:val="yellow"/>
-                <w:lang w:val="en-US"/>
-              </w:rPr>
-            </w:pPr>
-            <w:r>
-              <w:rPr>
-                <w:highlight w:val="yellow"/>
-                <w:lang w:val="en-US"/>
-              </w:rPr>
-              <w:t xml:space="preserve">{{ </w:t>
-            </w:r>
-            <w:proofErr w:type="spellStart"/>
-            <w:r>
-              <w:rPr>
-                <w:highlight w:val="yellow"/>
-                <w:lang w:val="en-US"/>
-              </w:rPr>
-              <w:t>d_max</w:t>
-            </w:r>
-            <w:proofErr w:type="spellEnd"/>
-            <w:r>
-              <w:rPr>
-                <w:highlight w:val="yellow"/>
-                <w:lang w:val="en-US"/>
-              </w:rPr>
-              <w:t xml:space="preserve"> }}</w:t>
-            </w:r>
-          </w:p>
-        </w:tc>
-        <w:tc>
-          <w:tcPr>
-            <w:tcW w:w="5341" w:type="dxa"/>
-          </w:tcPr>
-          <w:p>
-            <w:r>
-              <w:t>Макс диаметр.</w:t>
-            </w:r>
-          </w:p>
-        </w:tc>
-      </w:tr>
-      <w:tr>
-        <w:tc>
-          <w:tcPr>
-            <w:tcW w:w="5341" w:type="dxa"/>
-          </w:tcPr>
-          <w:p>
-            <w:pPr>
-              <w:rPr>
-                <w:highlight w:val="yellow"/>
-                <w:lang w:val="en-US"/>
-              </w:rPr>
-            </w:pPr>
-            <w:r>
-              <w:rPr>
-                <w:highlight w:val="yellow"/>
-                <w:lang w:val="en-US"/>
-              </w:rPr>
-              <w:t>{{ volume }}</w:t>
-            </w:r>
-          </w:p>
-        </w:tc>
-        <w:tc>
-          <w:tcPr>
-            <w:tcW w:w="5341" w:type="dxa"/>
-          </w:tcPr>
-          <w:p>
-            <w:r>
-              <w:t>Объём.</w:t>
-            </w:r>
-          </w:p>
-        </w:tc>
-      </w:tr>
-      <w:tr>
-        <w:tc>
-          <w:tcPr>
-            <w:tcW w:w="5341" w:type="dxa"/>
-          </w:tcPr>
-          <w:p>
-            <w:pPr>
-              <w:rPr>
-                <w:highlight w:val="yellow"/>
-                <w:lang w:val="en-US"/>
-              </w:rPr>
-            </w:pPr>
-            <w:r>
-              <w:rPr>
-                <w:highlight w:val="yellow"/>
-                <w:lang w:val="en-US"/>
-              </w:rPr>
-              <w:t>{{</w:t>
-            </w:r>
-            <w:r>
-              <w:rPr>
-                <w:highlight w:val="yellow"/>
-                <w:lang w:val="en-US"/>
-              </w:rPr>
-              <w:t xml:space="preserve"> </w:t>
-            </w:r>
-            <w:proofErr w:type="spellStart"/>
-            <w:r>
-              <w:rPr>
-                <w:highlight w:val="yellow"/>
-                <w:lang w:val="en-US"/>
-              </w:rPr>
-              <w:t>volume_total</w:t>
-            </w:r>
-            <w:proofErr w:type="spellEnd"/>
-            <w:r>
-              <w:rPr>
-                <w:highlight w:val="yellow"/>
-                <w:lang w:val="en-US"/>
-              </w:rPr>
-              <w:t xml:space="preserve"> }}</w:t>
-            </w:r>
-          </w:p>
-        </w:tc>
-        <w:tc>
-          <w:tcPr>
-            <w:tcW w:w="5341" w:type="dxa"/>
-          </w:tcPr>
-          <w:p>
-            <w:r>
               <w:t>Суммарный объём секции, л.</w:t>
             </w:r>
           </w:p>
@@ -854,23 +792,7 @@
                 <w:highlight w:val="yellow"/>
                 <w:lang w:val="en-US"/>
               </w:rPr>
-              <w:t xml:space="preserve">{{ </w:t>
-            </w:r>
-            <w:proofErr w:type="spellStart"/>
-            <w:r>
-              <w:rPr>
-                <w:highlight w:val="yellow"/>
-                <w:lang w:val="en-US"/>
-              </w:rPr>
-              <w:t>zav_nums</w:t>
-            </w:r>
-            <w:proofErr w:type="spellEnd"/>
-            <w:r>
-              <w:rPr>
-                <w:highlight w:val="yellow"/>
-                <w:lang w:val="en-US"/>
-              </w:rPr>
-              <w:t xml:space="preserve"> }}</w:t>
+              <w:t>{{ zav_nums }}</w:t>
             </w:r>
           </w:p>
         </w:tc>
@@ -902,38 +824,17 @@
                 <w:highlight w:val="yellow"/>
                 <w:lang w:val="en-US"/>
               </w:rPr>
-              <w:t xml:space="preserve">{{ </w:t>
-            </w:r>
-            <w:proofErr w:type="spellStart"/>
-            <w:r>
-              <w:rPr>
-                <w:highlight w:val="yellow"/>
-                <w:lang w:val="en-US"/>
-              </w:rPr>
-              <w:t>reg_nums</w:t>
-            </w:r>
-            <w:proofErr w:type="spellEnd"/>
-            <w:r>
-              <w:rPr>
-                <w:highlight w:val="yellow"/>
-                <w:lang w:val="en-US"/>
-              </w:rPr>
-              <w:t xml:space="preserve"> }}</w:t>
-            </w:r>
-          </w:p>
-        </w:tc>
-        <w:tc>
-          <w:tcPr>
-            <w:tcW w:w="5341" w:type="dxa"/>
-          </w:tcPr>
-          <w:p>
-            <w:proofErr w:type="spellStart"/>
-            <w:r>
-              <w:t>Рег</w:t>
-            </w:r>
-            <w:proofErr w:type="spellEnd"/>
-            <w:r>
-              <w:t xml:space="preserve"> номера баллонов.</w:t>
+              <w:t>{{ reg_nums }}</w:t>
+            </w:r>
+          </w:p>
+        </w:tc>
+        <w:tc>
+          <w:tcPr>
+            <w:tcW w:w="5341" w:type="dxa"/>
+          </w:tcPr>
+          <w:p>
+            <w:r>
+              <w:t>Рег номера баллонов.</w:t>
             </w:r>
           </w:p>
         </w:tc>
@@ -965,6 +866,47 @@
           </w:tcPr>
           <w:p>
             <w:r>
+              <w:t>Адрес м</w:t>
+            </w:r>
+            <w:r>
+              <w:t>ест</w:t>
+            </w:r>
+            <w:r>
+              <w:t>а</w:t>
+            </w:r>
+            <w:r>
+              <w:t xml:space="preserve"> установки.</w:t>
+            </w:r>
+          </w:p>
+        </w:tc>
+      </w:tr>
+      <w:tr>
+        <w:tc>
+          <w:tcPr>
+            <w:tcW w:w="5341" w:type="dxa"/>
+          </w:tcPr>
+          <w:p>
+            <w:pPr>
+              <w:rPr>
+                <w:highlight w:val="yellow"/>
+                <w:lang w:val="en-US"/>
+              </w:rPr>
+            </w:pPr>
+            <w:r>
+              <w:rPr>
+                <w:highlight w:val="yellow"/>
+                <w:lang w:val="en-US"/>
+              </w:rPr>
+              <w:t>{{ place_obj }}</w:t>
+            </w:r>
+          </w:p>
+        </w:tc>
+        <w:tc>
+          <w:tcPr>
+            <w:tcW w:w="5341" w:type="dxa"/>
+          </w:tcPr>
+          <w:p>
+            <w:r>
               <w:t>Место установки.</w:t>
             </w:r>
           </w:p>
@@ -987,23 +929,7 @@
                 <w:highlight w:val="yellow"/>
                 <w:lang w:val="en-US"/>
               </w:rPr>
-              <w:t xml:space="preserve">{{ </w:t>
-            </w:r>
-            <w:proofErr w:type="spellStart"/>
-            <w:r>
-              <w:rPr>
-                <w:highlight w:val="yellow"/>
-                <w:lang w:val="en-US"/>
-              </w:rPr>
-              <w:t>zavod_name</w:t>
-            </w:r>
-            <w:proofErr w:type="spellEnd"/>
-            <w:r>
-              <w:rPr>
-                <w:highlight w:val="yellow"/>
-                <w:lang w:val="en-US"/>
-              </w:rPr>
-              <w:t xml:space="preserve"> }}</w:t>
+              <w:t>{{ zavod_name }}</w:t>
             </w:r>
           </w:p>
         </w:tc>
@@ -1102,23 +1028,7 @@
                 <w:highlight w:val="yellow"/>
                 <w:lang w:val="en-US"/>
               </w:rPr>
-              <w:t xml:space="preserve">{{ </w:t>
-            </w:r>
-            <w:proofErr w:type="spellStart"/>
-            <w:r>
-              <w:rPr>
-                <w:highlight w:val="yellow"/>
-                <w:lang w:val="en-US"/>
-              </w:rPr>
-              <w:t>rab_sreda</w:t>
-            </w:r>
-            <w:proofErr w:type="spellEnd"/>
-            <w:r>
-              <w:rPr>
-                <w:highlight w:val="yellow"/>
-                <w:lang w:val="en-US"/>
-              </w:rPr>
-              <w:t xml:space="preserve"> }}</w:t>
+              <w:t>{{ rab_sreda }}</w:t>
             </w:r>
           </w:p>
         </w:tc>
@@ -1150,23 +1060,7 @@
                 <w:highlight w:val="yellow"/>
                 <w:lang w:val="en-US"/>
               </w:rPr>
-              <w:t xml:space="preserve">{{ </w:t>
-            </w:r>
-            <w:proofErr w:type="spellStart"/>
-            <w:r>
-              <w:rPr>
-                <w:highlight w:val="yellow"/>
-                <w:lang w:val="en-US"/>
-              </w:rPr>
-              <w:t>vladelec</w:t>
-            </w:r>
-            <w:proofErr w:type="spellEnd"/>
-            <w:r>
-              <w:rPr>
-                <w:highlight w:val="yellow"/>
-                <w:lang w:val="en-US"/>
-              </w:rPr>
-              <w:t xml:space="preserve"> }}</w:t>
+              <w:t>{{ vladelec }}</w:t>
             </w:r>
           </w:p>
         </w:tc>
@@ -1198,23 +1092,7 @@
                 <w:highlight w:val="yellow"/>
                 <w:lang w:val="en-US"/>
               </w:rPr>
-              <w:t xml:space="preserve">{{ </w:t>
-            </w:r>
-            <w:proofErr w:type="spellStart"/>
-            <w:r>
-              <w:rPr>
-                <w:highlight w:val="yellow"/>
-                <w:lang w:val="en-US"/>
-              </w:rPr>
-              <w:t>vik_date</w:t>
-            </w:r>
-            <w:proofErr w:type="spellEnd"/>
-            <w:r>
-              <w:rPr>
-                <w:highlight w:val="yellow"/>
-                <w:lang w:val="en-US"/>
-              </w:rPr>
-              <w:t xml:space="preserve"> }}</w:t>
+              <w:t>{{ vik_date }}</w:t>
             </w:r>
           </w:p>
         </w:tc>
@@ -1246,23 +1124,7 @@
                 <w:highlight w:val="yellow"/>
                 <w:lang w:val="en-US"/>
               </w:rPr>
-              <w:t xml:space="preserve">{{ </w:t>
-            </w:r>
-            <w:proofErr w:type="spellStart"/>
-            <w:r>
-              <w:rPr>
-                <w:highlight w:val="yellow"/>
-                <w:lang w:val="en-US"/>
-              </w:rPr>
-              <w:t>tolshTverdost_date</w:t>
-            </w:r>
-            <w:proofErr w:type="spellEnd"/>
-            <w:r>
-              <w:rPr>
-                <w:highlight w:val="yellow"/>
-                <w:lang w:val="en-US"/>
-              </w:rPr>
-              <w:t xml:space="preserve"> }}</w:t>
+              <w:t>{{ tolshTverdost_date }}</w:t>
             </w:r>
           </w:p>
         </w:tc>
@@ -1299,23 +1161,7 @@
                 <w:highlight w:val="yellow"/>
                 <w:lang w:val="en-US"/>
               </w:rPr>
-              <w:t xml:space="preserve">{{ </w:t>
-            </w:r>
-            <w:proofErr w:type="spellStart"/>
-            <w:r>
-              <w:rPr>
-                <w:highlight w:val="yellow"/>
-                <w:lang w:val="en-US"/>
-              </w:rPr>
-              <w:t>ispRasch_date</w:t>
-            </w:r>
-            <w:proofErr w:type="spellEnd"/>
-            <w:r>
-              <w:rPr>
-                <w:highlight w:val="yellow"/>
-                <w:lang w:val="en-US"/>
-              </w:rPr>
-              <w:t xml:space="preserve"> }}</w:t>
+              <w:t>{{ ispRasch_date }}</w:t>
             </w:r>
           </w:p>
         </w:tc>
@@ -1352,23 +1198,7 @@
                 <w:highlight w:val="yellow"/>
                 <w:lang w:val="en-US"/>
               </w:rPr>
-              <w:t xml:space="preserve">{{ </w:t>
-            </w:r>
-            <w:proofErr w:type="spellStart"/>
-            <w:r>
-              <w:rPr>
-                <w:highlight w:val="yellow"/>
-                <w:lang w:val="en-US"/>
-              </w:rPr>
-              <w:t>prodlEPB_date</w:t>
-            </w:r>
-            <w:proofErr w:type="spellEnd"/>
-            <w:r>
-              <w:rPr>
-                <w:highlight w:val="yellow"/>
-                <w:lang w:val="en-US"/>
-              </w:rPr>
-              <w:t xml:space="preserve"> }}</w:t>
+              <w:t>{{ prodlEPB_date }}</w:t>
             </w:r>
           </w:p>
         </w:tc>
@@ -1405,23 +1235,7 @@
                 <w:highlight w:val="yellow"/>
                 <w:lang w:val="en-US"/>
               </w:rPr>
-              <w:t xml:space="preserve">{{ </w:t>
-            </w:r>
-            <w:proofErr w:type="spellStart"/>
-            <w:r>
-              <w:rPr>
-                <w:highlight w:val="yellow"/>
-                <w:lang w:val="en-US"/>
-              </w:rPr>
-              <w:t>prodlTO_date</w:t>
-            </w:r>
-            <w:proofErr w:type="spellEnd"/>
-            <w:r>
-              <w:rPr>
-                <w:highlight w:val="yellow"/>
-                <w:lang w:val="en-US"/>
-              </w:rPr>
-              <w:t xml:space="preserve"> }}</w:t>
+              <w:t>{{ prodlTO_date }}</w:t>
             </w:r>
           </w:p>
         </w:tc>
@@ -1458,23 +1272,7 @@
                 <w:highlight w:val="yellow"/>
                 <w:lang w:val="en-US"/>
               </w:rPr>
-              <w:t xml:space="preserve">{{ </w:t>
-            </w:r>
-            <w:proofErr w:type="spellStart"/>
-            <w:r>
-              <w:rPr>
-                <w:highlight w:val="yellow"/>
-                <w:lang w:val="en-US"/>
-              </w:rPr>
-              <w:t>dogContract</w:t>
-            </w:r>
-            <w:proofErr w:type="spellEnd"/>
-            <w:r>
-              <w:rPr>
-                <w:highlight w:val="yellow"/>
-                <w:lang w:val="en-US"/>
-              </w:rPr>
-              <w:t xml:space="preserve"> }}</w:t>
+              <w:t>{{ dogContract }}</w:t>
             </w:r>
           </w:p>
         </w:tc>
@@ -1506,23 +1304,7 @@
                 <w:highlight w:val="yellow"/>
                 <w:lang w:val="en-US"/>
               </w:rPr>
-              <w:t xml:space="preserve">{{ </w:t>
-            </w:r>
-            <w:proofErr w:type="spellStart"/>
-            <w:r>
-              <w:rPr>
-                <w:highlight w:val="yellow"/>
-                <w:lang w:val="en-US"/>
-              </w:rPr>
-              <w:t>pricaz_contora</w:t>
-            </w:r>
-            <w:proofErr w:type="spellEnd"/>
-            <w:r>
-              <w:rPr>
-                <w:highlight w:val="yellow"/>
-                <w:lang w:val="en-US"/>
-              </w:rPr>
-              <w:t xml:space="preserve"> }}</w:t>
+              <w:t>{{ pricaz_contora }}</w:t>
             </w:r>
           </w:p>
         </w:tc>
@@ -1553,23 +1335,7 @@
                 <w:highlight w:val="yellow"/>
                 <w:lang w:val="en-US"/>
               </w:rPr>
-              <w:t xml:space="preserve">{{ </w:t>
-            </w:r>
-            <w:proofErr w:type="spellStart"/>
-            <w:r>
-              <w:rPr>
-                <w:highlight w:val="yellow"/>
-                <w:lang w:val="en-US"/>
-              </w:rPr>
-              <w:t>pricaz_vladelec</w:t>
-            </w:r>
-            <w:proofErr w:type="spellEnd"/>
-            <w:r>
-              <w:rPr>
-                <w:highlight w:val="yellow"/>
-                <w:lang w:val="en-US"/>
-              </w:rPr>
-              <w:t xml:space="preserve"> }}</w:t>
+              <w:t>{{ pricaz_vladelec }}</w:t>
             </w:r>
           </w:p>
         </w:tc>
@@ -1601,23 +1367,7 @@
                 <w:highlight w:val="yellow"/>
                 <w:lang w:val="en-US"/>
               </w:rPr>
-              <w:t xml:space="preserve">{{ </w:t>
-            </w:r>
-            <w:proofErr w:type="spellStart"/>
-            <w:r>
-              <w:rPr>
-                <w:highlight w:val="yellow"/>
-                <w:lang w:val="en-US"/>
-              </w:rPr>
-              <w:t>naznach</w:t>
-            </w:r>
-            <w:proofErr w:type="spellEnd"/>
-            <w:r>
-              <w:rPr>
-                <w:highlight w:val="yellow"/>
-                <w:lang w:val="en-US"/>
-              </w:rPr>
-              <w:t xml:space="preserve"> }}</w:t>
+              <w:t>{{ naznach }}</w:t>
             </w:r>
           </w:p>
         </w:tc>
@@ -1681,23 +1431,7 @@
                 <w:highlight w:val="yellow"/>
                 <w:lang w:val="en-US"/>
               </w:rPr>
-              <w:t xml:space="preserve">{{ </w:t>
-            </w:r>
-            <w:proofErr w:type="spellStart"/>
-            <w:r>
-              <w:rPr>
-                <w:highlight w:val="yellow"/>
-                <w:lang w:val="en-US"/>
-              </w:rPr>
-              <w:t>s_min_total</w:t>
-            </w:r>
-            <w:proofErr w:type="spellEnd"/>
-            <w:r>
-              <w:rPr>
-                <w:highlight w:val="yellow"/>
-                <w:lang w:val="en-US"/>
-              </w:rPr>
-              <w:t xml:space="preserve"> }}</w:t>
+              <w:t>{{ s_min_total }}</w:t>
             </w:r>
           </w:p>
         </w:tc>
@@ -1734,21 +1468,7 @@
               <w:rPr>
                 <w:highlight w:val="yellow"/>
               </w:rPr>
-              <w:t xml:space="preserve"> </w:t>
-            </w:r>
-            <w:proofErr w:type="spellStart"/>
-            <w:r>
-              <w:rPr>
-                <w:highlight w:val="yellow"/>
-              </w:rPr>
-              <w:t>zav_s_min</w:t>
-            </w:r>
-            <w:proofErr w:type="spellEnd"/>
-            <w:r>
-              <w:rPr>
-                <w:highlight w:val="yellow"/>
-              </w:rPr>
-              <w:t xml:space="preserve"> </w:t>
+              <w:t xml:space="preserve"> zav_s_min </w:t>
             </w:r>
             <w:r>
               <w:rPr>
@@ -1792,21 +1512,7 @@
               <w:rPr>
                 <w:highlight w:val="yellow"/>
               </w:rPr>
-              <w:t xml:space="preserve"> </w:t>
-            </w:r>
-            <w:proofErr w:type="spellStart"/>
-            <w:r>
-              <w:rPr>
-                <w:highlight w:val="yellow"/>
-              </w:rPr>
-              <w:t>obj_name</w:t>
-            </w:r>
-            <w:proofErr w:type="spellEnd"/>
-            <w:r>
-              <w:rPr>
-                <w:highlight w:val="yellow"/>
-              </w:rPr>
-              <w:t xml:space="preserve"> </w:t>
+              <w:t xml:space="preserve"> obj_name </w:t>
             </w:r>
             <w:r>
               <w:rPr>
@@ -1850,21 +1556,7 @@
               <w:rPr>
                 <w:highlight w:val="yellow"/>
               </w:rPr>
-              <w:t xml:space="preserve"> </w:t>
-            </w:r>
-            <w:proofErr w:type="spellStart"/>
-            <w:r>
-              <w:rPr>
-                <w:highlight w:val="yellow"/>
-              </w:rPr>
-              <w:t>prev_zakl</w:t>
-            </w:r>
-            <w:proofErr w:type="spellEnd"/>
-            <w:r>
-              <w:rPr>
-                <w:highlight w:val="yellow"/>
-              </w:rPr>
-              <w:t xml:space="preserve"> </w:t>
+              <w:t xml:space="preserve"> prev_zakl </w:t>
             </w:r>
             <w:r>
               <w:rPr>
@@ -1916,21 +1608,7 @@
               <w:rPr>
                 <w:highlight w:val="yellow"/>
               </w:rPr>
-              <w:t xml:space="preserve"> </w:t>
-            </w:r>
-            <w:proofErr w:type="spellStart"/>
-            <w:r>
-              <w:rPr>
-                <w:highlight w:val="yellow"/>
-              </w:rPr>
-              <w:t>prev_pg_am</w:t>
-            </w:r>
-            <w:proofErr w:type="spellEnd"/>
-            <w:r>
-              <w:rPr>
-                <w:highlight w:val="yellow"/>
-              </w:rPr>
-              <w:t xml:space="preserve"> </w:t>
+              <w:t xml:space="preserve"> prev_pg_am </w:t>
             </w:r>
             <w:r>
               <w:rPr>
@@ -1959,13 +1637,8 @@
       </w:tr>
     </w:tbl>
     <w:p>
-      <w:proofErr w:type="spellStart"/>
       <w:r>
-        <w:t>Плейсхолдеры</w:t>
-      </w:r>
-      <w:proofErr w:type="spellEnd"/>
-      <w:r>
-        <w:t xml:space="preserve"> для расчёта на прочность.</w:t>
+        <w:t>Плейсхолдеры для расчёта на прочность.</w:t>
       </w:r>
     </w:p>
     <w:tbl>
@@ -1984,11 +1657,9 @@
             <w:tcW w:w="5341" w:type="dxa"/>
           </w:tcPr>
           <w:p>
-            <w:proofErr w:type="spellStart"/>
             <w:r>
               <w:t>Плейсхолдер</w:t>
             </w:r>
-            <w:proofErr w:type="spellEnd"/>
           </w:p>
         </w:tc>
         <w:tc>
@@ -2032,7 +1703,6 @@
               </w:rPr>
               <w:t>_</w:t>
             </w:r>
-            <w:proofErr w:type="spellStart"/>
             <w:r>
               <w:rPr>
                 <w:highlight w:val="green"/>
@@ -2040,7 +1710,6 @@
               </w:rPr>
               <w:t>rab</w:t>
             </w:r>
-            <w:proofErr w:type="spellEnd"/>
             <w:r>
               <w:rPr>
                 <w:highlight w:val="green"/>
@@ -2103,7 +1772,6 @@
               </w:rPr>
               <w:t>_</w:t>
             </w:r>
-            <w:proofErr w:type="spellStart"/>
             <w:r>
               <w:rPr>
                 <w:highlight w:val="green"/>
@@ -2111,7 +1779,6 @@
               </w:rPr>
               <w:t>pnevma</w:t>
             </w:r>
-            <w:proofErr w:type="spellEnd"/>
             <w:r>
               <w:rPr>
                 <w:highlight w:val="green"/>
@@ -2151,23 +1818,7 @@
                 <w:highlight w:val="green"/>
                 <w:lang w:val="en-US"/>
               </w:rPr>
-              <w:t xml:space="preserve">{{ </w:t>
-            </w:r>
-            <w:proofErr w:type="spellStart"/>
-            <w:r>
-              <w:rPr>
-                <w:highlight w:val="green"/>
-                <w:lang w:val="en-US"/>
-              </w:rPr>
-              <w:t>p_pnevma_kgs</w:t>
-            </w:r>
-            <w:proofErr w:type="spellEnd"/>
-            <w:r>
-              <w:rPr>
-                <w:highlight w:val="green"/>
-                <w:lang w:val="en-US"/>
-              </w:rPr>
-              <w:t xml:space="preserve"> }}</w:t>
+              <w:t>{{ p_pnevma_kgs }}</w:t>
             </w:r>
           </w:p>
         </w:tc>
@@ -2199,23 +1850,8 @@
                 <w:highlight w:val="green"/>
                 <w:lang w:val="en-US"/>
               </w:rPr>
-              <w:t xml:space="preserve">{{ </w:t>
-            </w:r>
-            <w:proofErr w:type="spellStart"/>
-            <w:r>
-              <w:rPr>
-                <w:highlight w:val="green"/>
-                <w:lang w:val="en-US"/>
-              </w:rPr>
-              <w:t>p_gidro</w:t>
-            </w:r>
-            <w:proofErr w:type="spellEnd"/>
-            <w:r>
-              <w:rPr>
-                <w:highlight w:val="green"/>
-                <w:lang w:val="en-US"/>
-              </w:rPr>
-              <w:t xml:space="preserve"> }}</w:t>
+              <w:lastRenderedPageBreak/>
+              <w:t>{{ p_gidro }}</w:t>
             </w:r>
           </w:p>
         </w:tc>
@@ -2247,23 +1883,7 @@
                 <w:highlight w:val="green"/>
                 <w:lang w:val="en-US"/>
               </w:rPr>
-              <w:t xml:space="preserve">{{ </w:t>
-            </w:r>
-            <w:proofErr w:type="spellStart"/>
-            <w:r>
-              <w:rPr>
-                <w:highlight w:val="green"/>
-                <w:lang w:val="en-US"/>
-              </w:rPr>
-              <w:t>d_vnutr</w:t>
-            </w:r>
-            <w:proofErr w:type="spellEnd"/>
-            <w:r>
-              <w:rPr>
-                <w:highlight w:val="green"/>
-                <w:lang w:val="en-US"/>
-              </w:rPr>
-              <w:t xml:space="preserve"> }}</w:t>
+              <w:t>{{ d_vnutr }}</w:t>
             </w:r>
           </w:p>
         </w:tc>
@@ -2295,23 +1915,7 @@
                 <w:highlight w:val="green"/>
                 <w:lang w:val="en-US"/>
               </w:rPr>
-              <w:t xml:space="preserve">{{ </w:t>
-            </w:r>
-            <w:proofErr w:type="spellStart"/>
-            <w:r>
-              <w:rPr>
-                <w:highlight w:val="green"/>
-                <w:lang w:val="en-US"/>
-              </w:rPr>
-              <w:t>gost_material</w:t>
-            </w:r>
-            <w:proofErr w:type="spellEnd"/>
-            <w:r>
-              <w:rPr>
-                <w:highlight w:val="green"/>
-                <w:lang w:val="en-US"/>
-              </w:rPr>
-              <w:t xml:space="preserve"> }}</w:t>
+              <w:t>{{ gost_material }}</w:t>
             </w:r>
           </w:p>
         </w:tc>
@@ -2324,15 +1928,7 @@
               <w:t xml:space="preserve">ГОСТ, материал. Взять из </w:t>
             </w:r>
             <w:r>
-              <w:t xml:space="preserve">{{ </w:t>
-            </w:r>
-            <w:proofErr w:type="spellStart"/>
-            <w:r>
-              <w:t>gost</w:t>
-            </w:r>
-            <w:proofErr w:type="spellEnd"/>
-            <w:r>
-              <w:t xml:space="preserve"> }}</w:t>
+              <w:t>{{ gost }}</w:t>
             </w:r>
             <w:r>
               <w:t>.</w:t>
@@ -2357,23 +1953,7 @@
                 <w:highlight w:val="green"/>
                 <w:lang w:val="en-US"/>
               </w:rPr>
-              <w:t xml:space="preserve">{{ </w:t>
-            </w:r>
-            <w:proofErr w:type="spellStart"/>
-            <w:r>
-              <w:rPr>
-                <w:highlight w:val="green"/>
-                <w:lang w:val="en-US"/>
-              </w:rPr>
-              <w:t>pred_tek_min</w:t>
-            </w:r>
-            <w:proofErr w:type="spellEnd"/>
-            <w:r>
-              <w:rPr>
-                <w:highlight w:val="green"/>
-                <w:lang w:val="en-US"/>
-              </w:rPr>
-              <w:t xml:space="preserve"> }}</w:t>
+              <w:t>{{ pred_tek_min }}</w:t>
             </w:r>
           </w:p>
         </w:tc>
@@ -2405,23 +1985,7 @@
                 <w:highlight w:val="green"/>
                 <w:lang w:val="en-US"/>
               </w:rPr>
-              <w:t xml:space="preserve">{{ </w:t>
-            </w:r>
-            <w:proofErr w:type="spellStart"/>
-            <w:r>
-              <w:rPr>
-                <w:highlight w:val="green"/>
-                <w:lang w:val="en-US"/>
-              </w:rPr>
-              <w:t>vrem_sopr_min</w:t>
-            </w:r>
-            <w:proofErr w:type="spellEnd"/>
-            <w:r>
-              <w:rPr>
-                <w:highlight w:val="green"/>
-                <w:lang w:val="en-US"/>
-              </w:rPr>
-              <w:t xml:space="preserve"> }}</w:t>
+              <w:t>{{ vrem_sopr_min }}</w:t>
             </w:r>
           </w:p>
         </w:tc>
@@ -2453,7 +2017,6 @@
                 <w:highlight w:val="green"/>
                 <w:lang w:val="en-US"/>
               </w:rPr>
-              <w:lastRenderedPageBreak/>
               <w:t>{{ sigma }}</w:t>
             </w:r>
           </w:p>
@@ -2486,79 +2049,39 @@
                 <w:highlight w:val="green"/>
                 <w:lang w:val="en-US"/>
               </w:rPr>
-              <w:t xml:space="preserve">{{ </w:t>
-            </w:r>
-            <w:proofErr w:type="spellStart"/>
-            <w:r>
-              <w:rPr>
-                <w:highlight w:val="green"/>
-                <w:lang w:val="en-US"/>
-              </w:rPr>
-              <w:t>sigma_gidro</w:t>
-            </w:r>
-            <w:proofErr w:type="spellEnd"/>
-            <w:r>
-              <w:rPr>
-                <w:highlight w:val="green"/>
-                <w:lang w:val="en-US"/>
-              </w:rPr>
-              <w:t xml:space="preserve"> }}</w:t>
-            </w:r>
-          </w:p>
-        </w:tc>
-        <w:tc>
-          <w:tcPr>
-            <w:tcW w:w="5341" w:type="dxa"/>
-          </w:tcPr>
-          <w:p>
-            <w:r>
-              <w:t xml:space="preserve">Допускаемое </w:t>
-            </w:r>
-            <w:proofErr w:type="spellStart"/>
-            <w:r>
-              <w:t>гидро</w:t>
-            </w:r>
-            <w:proofErr w:type="spellEnd"/>
-            <w:r>
-              <w:t xml:space="preserve"> напряжение.</w:t>
-            </w:r>
-          </w:p>
-        </w:tc>
-      </w:tr>
-      <w:tr>
-        <w:tc>
-          <w:tcPr>
-            <w:tcW w:w="5341" w:type="dxa"/>
-          </w:tcPr>
-          <w:p>
-            <w:pPr>
-              <w:rPr>
-                <w:highlight w:val="green"/>
-                <w:lang w:val="en-US"/>
-              </w:rPr>
-            </w:pPr>
-            <w:r>
-              <w:rPr>
-                <w:highlight w:val="green"/>
-                <w:lang w:val="en-US"/>
-              </w:rPr>
-              <w:t xml:space="preserve">{{ </w:t>
-            </w:r>
-            <w:proofErr w:type="spellStart"/>
-            <w:r>
-              <w:rPr>
-                <w:highlight w:val="green"/>
-                <w:lang w:val="en-US"/>
-              </w:rPr>
-              <w:t>s_rasch</w:t>
-            </w:r>
-            <w:proofErr w:type="spellEnd"/>
-            <w:r>
-              <w:rPr>
-                <w:highlight w:val="green"/>
-                <w:lang w:val="en-US"/>
-              </w:rPr>
-              <w:t xml:space="preserve"> }}</w:t>
+              <w:t>{{ sigma_gidro }}</w:t>
+            </w:r>
+          </w:p>
+        </w:tc>
+        <w:tc>
+          <w:tcPr>
+            <w:tcW w:w="5341" w:type="dxa"/>
+          </w:tcPr>
+          <w:p>
+            <w:r>
+              <w:t>Допускаемое гидро напряжение.</w:t>
+            </w:r>
+          </w:p>
+        </w:tc>
+      </w:tr>
+      <w:tr>
+        <w:tc>
+          <w:tcPr>
+            <w:tcW w:w="5341" w:type="dxa"/>
+          </w:tcPr>
+          <w:p>
+            <w:pPr>
+              <w:rPr>
+                <w:highlight w:val="green"/>
+                <w:lang w:val="en-US"/>
+              </w:rPr>
+            </w:pPr>
+            <w:r>
+              <w:rPr>
+                <w:highlight w:val="green"/>
+                <w:lang w:val="en-US"/>
+              </w:rPr>
+              <w:t>{{ s_rasch }}</w:t>
             </w:r>
           </w:p>
         </w:tc>
@@ -2596,23 +2119,7 @@
                 <w:highlight w:val="green"/>
                 <w:lang w:val="en-US"/>
               </w:rPr>
-              <w:t xml:space="preserve">{{ </w:t>
-            </w:r>
-            <w:proofErr w:type="spellStart"/>
-            <w:r>
-              <w:rPr>
-                <w:highlight w:val="green"/>
-                <w:lang w:val="en-US"/>
-              </w:rPr>
-              <w:t>s_rasch_gidro</w:t>
-            </w:r>
-            <w:proofErr w:type="spellEnd"/>
-            <w:r>
-              <w:rPr>
-                <w:highlight w:val="green"/>
-                <w:lang w:val="en-US"/>
-              </w:rPr>
-              <w:t xml:space="preserve"> }}</w:t>
+              <w:t>{{ s_rasch_gidro }}</w:t>
             </w:r>
           </w:p>
         </w:tc>
@@ -2628,53 +2135,29 @@
               <w:t xml:space="preserve">S </w:t>
             </w:r>
             <w:r>
-              <w:t xml:space="preserve">расчётное </w:t>
-            </w:r>
-            <w:proofErr w:type="spellStart"/>
-            <w:r>
-              <w:t>гидро</w:t>
-            </w:r>
-            <w:proofErr w:type="spellEnd"/>
-            <w:r>
-              <w:t>.</w:t>
-            </w:r>
-          </w:p>
-        </w:tc>
-      </w:tr>
-      <w:tr>
-        <w:tc>
-          <w:tcPr>
-            <w:tcW w:w="5341" w:type="dxa"/>
-          </w:tcPr>
-          <w:p>
-            <w:pPr>
-              <w:rPr>
-                <w:highlight w:val="green"/>
-                <w:lang w:val="en-US"/>
-              </w:rPr>
-            </w:pPr>
-            <w:r>
-              <w:rPr>
-                <w:highlight w:val="green"/>
-                <w:lang w:val="en-US"/>
-              </w:rPr>
-              <w:t xml:space="preserve">{{ </w:t>
-            </w:r>
-            <w:proofErr w:type="spellStart"/>
-            <w:r>
-              <w:rPr>
-                <w:highlight w:val="green"/>
-                <w:lang w:val="en-US"/>
-              </w:rPr>
-              <w:t>s_max_rasch</w:t>
-            </w:r>
-            <w:proofErr w:type="spellEnd"/>
-            <w:r>
-              <w:rPr>
-                <w:highlight w:val="green"/>
-                <w:lang w:val="en-US"/>
-              </w:rPr>
-              <w:t xml:space="preserve"> }}</w:t>
+              <w:t>расчётное гидро.</w:t>
+            </w:r>
+          </w:p>
+        </w:tc>
+      </w:tr>
+      <w:tr>
+        <w:tc>
+          <w:tcPr>
+            <w:tcW w:w="5341" w:type="dxa"/>
+          </w:tcPr>
+          <w:p>
+            <w:pPr>
+              <w:rPr>
+                <w:highlight w:val="green"/>
+                <w:lang w:val="en-US"/>
+              </w:rPr>
+            </w:pPr>
+            <w:r>
+              <w:rPr>
+                <w:highlight w:val="green"/>
+                <w:lang w:val="en-US"/>
+              </w:rPr>
+              <w:t>{{ s_max_rasch }}</w:t>
             </w:r>
           </w:p>
         </w:tc>
@@ -2698,13 +2181,8 @@
     </w:tbl>
     <w:p/>
     <w:p>
-      <w:proofErr w:type="spellStart"/>
       <w:r>
-        <w:t>Плейсхолдеры</w:t>
-      </w:r>
-      <w:proofErr w:type="spellEnd"/>
-      <w:r>
-        <w:t xml:space="preserve"> для расчёта остаточного ресурса.</w:t>
+        <w:t>Плейсхолдеры для расчёта остаточного ресурса.</w:t>
       </w:r>
     </w:p>
     <w:tbl>
@@ -2723,11 +2201,9 @@
             <w:tcW w:w="5341" w:type="dxa"/>
           </w:tcPr>
           <w:p>
-            <w:proofErr w:type="spellStart"/>
             <w:r>
               <w:t>Плейсхолдер</w:t>
             </w:r>
-            <w:proofErr w:type="spellEnd"/>
           </w:p>
         </w:tc>
         <w:tc>
@@ -2752,40 +2228,54 @@
                 <w:highlight w:val="magenta"/>
               </w:rPr>
             </w:pPr>
-            <w:bookmarkStart w:id="0" w:name="_GoBack"/>
             <w:r>
               <w:rPr>
                 <w:highlight w:val="magenta"/>
                 <w:lang w:val="en-US"/>
               </w:rPr>
-              <w:t xml:space="preserve">{{ </w:t>
-            </w:r>
-            <w:proofErr w:type="spellStart"/>
-            <w:r>
+              <w:t>{{ a_corr }}</w:t>
+            </w:r>
+          </w:p>
+        </w:tc>
+        <w:tc>
+          <w:tcPr>
+            <w:tcW w:w="5341" w:type="dxa"/>
+          </w:tcPr>
+          <w:p>
+            <w:r>
+              <w:t>Коррозия, а.</w:t>
+            </w:r>
+          </w:p>
+        </w:tc>
+      </w:tr>
+      <w:tr>
+        <w:tc>
+          <w:tcPr>
+            <w:tcW w:w="5341" w:type="dxa"/>
+          </w:tcPr>
+          <w:p>
+            <w:pPr>
               <w:rPr>
                 <w:highlight w:val="magenta"/>
                 <w:lang w:val="en-US"/>
               </w:rPr>
-              <w:t>a_corr</w:t>
-            </w:r>
-            <w:proofErr w:type="spellEnd"/>
+            </w:pPr>
             <w:r>
               <w:rPr>
                 <w:highlight w:val="magenta"/>
                 <w:lang w:val="en-US"/>
               </w:rPr>
-              <w:t xml:space="preserve"> }}</w:t>
-            </w:r>
-            <w:bookmarkEnd w:id="0"/>
-          </w:p>
-        </w:tc>
-        <w:tc>
-          <w:tcPr>
-            <w:tcW w:w="5341" w:type="dxa"/>
-          </w:tcPr>
-          <w:p>
-            <w:r>
-              <w:t>Коррозия, а.</w:t>
+              <w:t>{{ c0_plus_dop }}</w:t>
+            </w:r>
+          </w:p>
+        </w:tc>
+        <w:tc>
+          <w:tcPr>
+            <w:tcW w:w="5341" w:type="dxa"/>
+          </w:tcPr>
+          <w:p>
+            <w:r>
+              <w:t>Со – допуск на толщину стенки.</w:t>
             </w:r>
           </w:p>
         </w:tc>
@@ -2799,7 +2289,6 @@
             <w:pPr>
               <w:rPr>
                 <w:highlight w:val="magenta"/>
-                <w:lang w:val="en-US"/>
               </w:rPr>
             </w:pPr>
             <w:r>
@@ -2807,17 +2296,23 @@
                 <w:highlight w:val="magenta"/>
                 <w:lang w:val="en-US"/>
               </w:rPr>
-              <w:t>{{ c0_plus_dop }}</w:t>
-            </w:r>
-          </w:p>
-        </w:tc>
-        <w:tc>
-          <w:tcPr>
-            <w:tcW w:w="5341" w:type="dxa"/>
-          </w:tcPr>
-          <w:p>
-            <w:r>
-              <w:t>Со – допуск на толщину стенки.</w:t>
+              <w:t>{{ tk_years }}</w:t>
+            </w:r>
+          </w:p>
+        </w:tc>
+        <w:tc>
+          <w:tcPr>
+            <w:tcW w:w="5341" w:type="dxa"/>
+          </w:tcPr>
+          <w:p>
+            <w:r>
+              <w:rPr>
+                <w:lang w:val="en-US"/>
+              </w:rPr>
+              <w:t xml:space="preserve">Tk </w:t>
+            </w:r>
+            <w:r>
+              <w:t>в годах.</w:t>
             </w:r>
           </w:p>
         </w:tc>
@@ -2831,6 +2326,7 @@
             <w:pPr>
               <w:rPr>
                 <w:highlight w:val="magenta"/>
+                <w:lang w:val="en-US"/>
               </w:rPr>
             </w:pPr>
             <w:r>
@@ -2838,85 +2334,7 @@
                 <w:highlight w:val="magenta"/>
                 <w:lang w:val="en-US"/>
               </w:rPr>
-              <w:t xml:space="preserve">{{ </w:t>
-            </w:r>
-            <w:proofErr w:type="spellStart"/>
-            <w:r>
-              <w:rPr>
-                <w:highlight w:val="magenta"/>
-                <w:lang w:val="en-US"/>
-              </w:rPr>
-              <w:t>tk_years</w:t>
-            </w:r>
-            <w:proofErr w:type="spellEnd"/>
-            <w:r>
-              <w:rPr>
-                <w:highlight w:val="magenta"/>
-                <w:lang w:val="en-US"/>
-              </w:rPr>
-              <w:t xml:space="preserve"> }}</w:t>
-            </w:r>
-          </w:p>
-        </w:tc>
-        <w:tc>
-          <w:tcPr>
-            <w:tcW w:w="5341" w:type="dxa"/>
-          </w:tcPr>
-          <w:p>
-            <w:proofErr w:type="spellStart"/>
-            <w:r>
-              <w:rPr>
-                <w:lang w:val="en-US"/>
-              </w:rPr>
-              <w:t>Tk</w:t>
-            </w:r>
-            <w:proofErr w:type="spellEnd"/>
-            <w:r>
-              <w:rPr>
-                <w:lang w:val="en-US"/>
-              </w:rPr>
-              <w:t xml:space="preserve"> </w:t>
-            </w:r>
-            <w:r>
-              <w:t>в годах.</w:t>
-            </w:r>
-          </w:p>
-        </w:tc>
-      </w:tr>
-      <w:tr>
-        <w:tc>
-          <w:tcPr>
-            <w:tcW w:w="5341" w:type="dxa"/>
-          </w:tcPr>
-          <w:p>
-            <w:pPr>
-              <w:rPr>
-                <w:highlight w:val="magenta"/>
-                <w:lang w:val="en-US"/>
-              </w:rPr>
-            </w:pPr>
-            <w:r>
-              <w:rPr>
-                <w:highlight w:val="magenta"/>
-                <w:lang w:val="en-US"/>
-              </w:rPr>
-              <w:t xml:space="preserve">{{ </w:t>
-            </w:r>
-            <w:proofErr w:type="spellStart"/>
-            <w:r>
-              <w:rPr>
-                <w:highlight w:val="magenta"/>
-                <w:lang w:val="en-US"/>
-              </w:rPr>
-              <w:t>tk_just</w:t>
-            </w:r>
-            <w:proofErr w:type="spellEnd"/>
-            <w:r>
-              <w:rPr>
-                <w:highlight w:val="magenta"/>
-                <w:lang w:val="en-US"/>
-              </w:rPr>
-              <w:t xml:space="preserve"> }}</w:t>
+              <w:t>{{ tk_just }}</w:t>
             </w:r>
           </w:p>
         </w:tc>
@@ -2953,7 +2371,7 @@
 </file>
 
 <file path=word/styles.xml><?xml version="1.0" encoding="utf-8"?>
-<w:styles xmlns:mc="http://schemas.openxmlformats.org/markup-compatibility/2006" xmlns:r="http://schemas.openxmlformats.org/officeDocument/2006/relationships" xmlns:w="http://schemas.openxmlformats.org/wordprocessingml/2006/main" xmlns:w14="http://schemas.microsoft.com/office/word/2010/wordml" xmlns:w15="http://schemas.microsoft.com/office/word/2012/wordml" xmlns:w16se="http://schemas.microsoft.com/office/word/2015/wordml/symex" mc:Ignorable="w14 w15 w16se">
+<w:styles xmlns:mc="http://schemas.openxmlformats.org/markup-compatibility/2006" xmlns:r="http://schemas.openxmlformats.org/officeDocument/2006/relationships" xmlns:w="http://schemas.openxmlformats.org/wordprocessingml/2006/main" xmlns:w14="http://schemas.microsoft.com/office/word/2010/wordml" xmlns:w15="http://schemas.microsoft.com/office/word/2012/wordml" xmlns:w16cex="http://schemas.microsoft.com/office/word/2018/wordml/cex" xmlns:w16cid="http://schemas.microsoft.com/office/word/2016/wordml/cid" xmlns:w16="http://schemas.microsoft.com/office/word/2018/wordml" xmlns:w16se="http://schemas.microsoft.com/office/word/2015/wordml/symex" mc:Ignorable="w14 w15 w16se w16cid w16 w16cex">
   <w:docDefaults>
     <w:rPrDefault>
       <w:rPr>
@@ -2963,7 +2381,7 @@
     </w:rPrDefault>
     <w:pPrDefault/>
   </w:docDefaults>
-  <w:latentStyles w:defLockedState="0" w:defUIPriority="99" w:defSemiHidden="0" w:defUnhideWhenUsed="0" w:defQFormat="0" w:count="371">
+  <w:latentStyles w:defLockedState="0" w:defUIPriority="99" w:defSemiHidden="0" w:defUnhideWhenUsed="0" w:defQFormat="0" w:count="376">
     <w:lsdException w:name="Normal" w:uiPriority="0" w:qFormat="1"/>
     <w:lsdException w:name="heading 1" w:uiPriority="0" w:qFormat="1"/>
     <w:lsdException w:name="heading 2" w:semiHidden="1" w:uiPriority="0" w:unhideWhenUsed="1" w:qFormat="1"/>
@@ -3335,6 +2753,11 @@
     <w:lsdException w:name="List Table 5 Dark Accent 6" w:uiPriority="50"/>
     <w:lsdException w:name="List Table 6 Colorful Accent 6" w:uiPriority="51"/>
     <w:lsdException w:name="List Table 7 Colorful Accent 6" w:uiPriority="52"/>
+    <w:lsdException w:name="Mention" w:semiHidden="1" w:unhideWhenUsed="1"/>
+    <w:lsdException w:name="Smart Hyperlink" w:semiHidden="1" w:unhideWhenUsed="1"/>
+    <w:lsdException w:name="Hashtag" w:semiHidden="1" w:unhideWhenUsed="1"/>
+    <w:lsdException w:name="Unresolved Mention" w:semiHidden="1" w:unhideWhenUsed="1"/>
+    <w:lsdException w:name="Smart Link" w:semiHidden="1" w:unhideWhenUsed="1"/>
   </w:latentStyles>
   <w:style w:type="paragraph" w:default="1" w:styleId="a">
     <w:name w:val="Normal"/>

</xml_diff>

<commit_message>
little changes in min-max years, fixed some bugs.
</commit_message>
<xml_diff>
--- a/Плейсхолдеры_шаблона.docx
+++ b/Плейсхолдеры_шаблона.docx
@@ -1,11 +1,24 @@
 
 <file path=word/document.xml><?xml version="1.0" encoding="utf-8"?>
-<w:document xmlns:wpc="http://schemas.microsoft.com/office/word/2010/wordprocessingCanvas" xmlns:cx="http://schemas.microsoft.com/office/drawing/2014/chartex" xmlns:cx1="http://schemas.microsoft.com/office/drawing/2015/9/8/chartex" xmlns:cx2="http://schemas.microsoft.com/office/drawing/2015/10/21/chartex" xmlns:cx3="http://schemas.microsoft.com/office/drawing/2016/5/9/chartex" xmlns:cx4="http://schemas.microsoft.com/office/drawing/2016/5/10/chartex" xmlns:cx5="http://schemas.microsoft.com/office/drawing/2016/5/11/chartex" xmlns:cx6="http://schemas.microsoft.com/office/drawing/2016/5/12/chartex" xmlns:cx7="http://schemas.microsoft.com/office/drawing/2016/5/13/chartex" xmlns:cx8="http://schemas.microsoft.com/office/drawing/2016/5/14/chartex" xmlns:mc="http://schemas.openxmlformats.org/markup-compatibility/2006" xmlns:aink="http://schemas.microsoft.com/office/drawing/2016/ink" xmlns:am3d="http://schemas.microsoft.com/office/drawing/2017/model3d" xmlns:o="urn:schemas-microsoft-com:office:office" xmlns:r="http://schemas.openxmlformats.org/officeDocument/2006/relationships" xmlns:m="http://schemas.openxmlformats.org/officeDocument/2006/math" xmlns:v="urn:schemas-microsoft-com:vml" xmlns:wp14="http://schemas.microsoft.com/office/word/2010/wordprocessingDrawing" xmlns:wp="http://schemas.openxmlformats.org/drawingml/2006/wordprocessingDrawing" xmlns:w10="urn:schemas-microsoft-com:office:word" xmlns:w="http://schemas.openxmlformats.org/wordprocessingml/2006/main" xmlns:w14="http://schemas.microsoft.com/office/word/2010/wordml" xmlns:w15="http://schemas.microsoft.com/office/word/2012/wordml" xmlns:w16cex="http://schemas.microsoft.com/office/word/2018/wordml/cex" xmlns:w16cid="http://schemas.microsoft.com/office/word/2016/wordml/cid" xmlns:w16="http://schemas.microsoft.com/office/word/2018/wordml" xmlns:w16se="http://schemas.microsoft.com/office/word/2015/wordml/symex" xmlns:wpg="http://schemas.microsoft.com/office/word/2010/wordprocessingGroup" xmlns:wpi="http://schemas.microsoft.com/office/word/2010/wordprocessingInk" xmlns:wne="http://schemas.microsoft.com/office/word/2006/wordml" xmlns:wps="http://schemas.microsoft.com/office/word/2010/wordprocessingShape" mc:Ignorable="w14 w15 w16se w16cid w16 w16cex wp14">
+<w:document xmlns:wpc="http://schemas.microsoft.com/office/word/2010/wordprocessingCanvas" xmlns:cx="http://schemas.microsoft.com/office/drawing/2014/chartex" xmlns:mc="http://schemas.openxmlformats.org/markup-compatibility/2006" xmlns:o="urn:schemas-microsoft-com:office:office" xmlns:r="http://schemas.openxmlformats.org/officeDocument/2006/relationships" xmlns:m="http://schemas.openxmlformats.org/officeDocument/2006/math" xmlns:v="urn:schemas-microsoft-com:vml" xmlns:wp14="http://schemas.microsoft.com/office/word/2010/wordprocessingDrawing" xmlns:wp="http://schemas.openxmlformats.org/drawingml/2006/wordprocessingDrawing" xmlns:w10="urn:schemas-microsoft-com:office:word" xmlns:w="http://schemas.openxmlformats.org/wordprocessingml/2006/main" xmlns:w14="http://schemas.microsoft.com/office/word/2010/wordml" xmlns:w15="http://schemas.microsoft.com/office/word/2012/wordml" xmlns:w16se="http://schemas.microsoft.com/office/word/2015/wordml/symex" xmlns:wpg="http://schemas.microsoft.com/office/word/2010/wordprocessingGroup" xmlns:wpi="http://schemas.microsoft.com/office/word/2010/wordprocessingInk" xmlns:wne="http://schemas.microsoft.com/office/word/2006/wordml" xmlns:wps="http://schemas.microsoft.com/office/word/2010/wordprocessingShape" mc:Ignorable="w14 w15 w16se wp14">
   <w:body>
     <w:p>
       <w:r>
-        <w:t>Таблица плейсхолдеров для шаблона закла</w:t>
+        <w:t xml:space="preserve">Таблица </w:t>
       </w:r>
+      <w:proofErr w:type="spellStart"/>
+      <w:r>
+        <w:t>плейсхолдеров</w:t>
+      </w:r>
+      <w:proofErr w:type="spellEnd"/>
+      <w:r>
+        <w:t xml:space="preserve"> для шаблона </w:t>
+      </w:r>
+      <w:proofErr w:type="spellStart"/>
+      <w:r>
+        <w:t>закла</w:t>
+      </w:r>
+      <w:proofErr w:type="spellEnd"/>
     </w:p>
     <w:p/>
     <w:tbl>
@@ -29,9 +42,11 @@
                 <w:highlight w:val="yellow"/>
               </w:rPr>
             </w:pPr>
+            <w:proofErr w:type="spellStart"/>
             <w:r>
               <w:t>Плейсхолдер</w:t>
             </w:r>
+            <w:proofErr w:type="spellEnd"/>
           </w:p>
         </w:tc>
         <w:tc>
@@ -62,71 +77,132 @@
                 <w:highlight w:val="yellow"/>
                 <w:lang w:val="en-US"/>
               </w:rPr>
-              <w:t>{{ zakl_number }}</w:t>
-            </w:r>
-          </w:p>
-        </w:tc>
-        <w:tc>
-          <w:tcPr>
-            <w:tcW w:w="5341" w:type="dxa"/>
-          </w:tcPr>
-          <w:p>
-            <w:r>
-              <w:t>Номер закла.</w:t>
-            </w:r>
-          </w:p>
-        </w:tc>
-      </w:tr>
-      <w:tr>
-        <w:tc>
-          <w:tcPr>
-            <w:tcW w:w="5341" w:type="dxa"/>
-          </w:tcPr>
-          <w:p>
-            <w:pPr>
-              <w:rPr>
-                <w:highlight w:val="yellow"/>
-                <w:lang w:val="en-US"/>
-              </w:rPr>
-            </w:pPr>
-            <w:r>
-              <w:rPr>
-                <w:highlight w:val="yellow"/>
-                <w:lang w:val="en-US"/>
-              </w:rPr>
-              <w:t>{{ reg_number }}</w:t>
-            </w:r>
-          </w:p>
-        </w:tc>
-        <w:tc>
-          <w:tcPr>
-            <w:tcW w:w="5341" w:type="dxa"/>
-          </w:tcPr>
-          <w:p>
-            <w:r>
-              <w:t>Рег секции.</w:t>
-            </w:r>
-          </w:p>
-        </w:tc>
-      </w:tr>
-      <w:tr>
-        <w:tc>
-          <w:tcPr>
-            <w:tcW w:w="5341" w:type="dxa"/>
-          </w:tcPr>
-          <w:p>
-            <w:pPr>
-              <w:rPr>
-                <w:highlight w:val="yellow"/>
-                <w:lang w:val="en-US"/>
-              </w:rPr>
-            </w:pPr>
-            <w:r>
-              <w:rPr>
-                <w:highlight w:val="yellow"/>
-                <w:lang w:val="en-US"/>
-              </w:rPr>
-              <w:t>{{ gost }}</w:t>
+              <w:t xml:space="preserve">{{ </w:t>
+            </w:r>
+            <w:proofErr w:type="spellStart"/>
+            <w:r>
+              <w:rPr>
+                <w:highlight w:val="yellow"/>
+                <w:lang w:val="en-US"/>
+              </w:rPr>
+              <w:t>zakl_number</w:t>
+            </w:r>
+            <w:proofErr w:type="spellEnd"/>
+            <w:r>
+              <w:rPr>
+                <w:highlight w:val="yellow"/>
+                <w:lang w:val="en-US"/>
+              </w:rPr>
+              <w:t xml:space="preserve"> }}</w:t>
+            </w:r>
+          </w:p>
+        </w:tc>
+        <w:tc>
+          <w:tcPr>
+            <w:tcW w:w="5341" w:type="dxa"/>
+          </w:tcPr>
+          <w:p>
+            <w:r>
+              <w:t xml:space="preserve">Номер </w:t>
+            </w:r>
+            <w:proofErr w:type="spellStart"/>
+            <w:r>
+              <w:t>закла</w:t>
+            </w:r>
+            <w:proofErr w:type="spellEnd"/>
+            <w:r>
+              <w:t>.</w:t>
+            </w:r>
+          </w:p>
+        </w:tc>
+      </w:tr>
+      <w:tr>
+        <w:tc>
+          <w:tcPr>
+            <w:tcW w:w="5341" w:type="dxa"/>
+          </w:tcPr>
+          <w:p>
+            <w:pPr>
+              <w:rPr>
+                <w:highlight w:val="yellow"/>
+                <w:lang w:val="en-US"/>
+              </w:rPr>
+            </w:pPr>
+            <w:r>
+              <w:rPr>
+                <w:highlight w:val="yellow"/>
+                <w:lang w:val="en-US"/>
+              </w:rPr>
+              <w:t xml:space="preserve">{{ </w:t>
+            </w:r>
+            <w:proofErr w:type="spellStart"/>
+            <w:r>
+              <w:rPr>
+                <w:highlight w:val="yellow"/>
+                <w:lang w:val="en-US"/>
+              </w:rPr>
+              <w:t>reg_number</w:t>
+            </w:r>
+            <w:proofErr w:type="spellEnd"/>
+            <w:r>
+              <w:rPr>
+                <w:highlight w:val="yellow"/>
+                <w:lang w:val="en-US"/>
+              </w:rPr>
+              <w:t xml:space="preserve"> }}</w:t>
+            </w:r>
+          </w:p>
+        </w:tc>
+        <w:tc>
+          <w:tcPr>
+            <w:tcW w:w="5341" w:type="dxa"/>
+          </w:tcPr>
+          <w:p>
+            <w:proofErr w:type="spellStart"/>
+            <w:r>
+              <w:t>Рег</w:t>
+            </w:r>
+            <w:proofErr w:type="spellEnd"/>
+            <w:r>
+              <w:t xml:space="preserve"> секции.</w:t>
+            </w:r>
+          </w:p>
+        </w:tc>
+      </w:tr>
+      <w:tr>
+        <w:tc>
+          <w:tcPr>
+            <w:tcW w:w="5341" w:type="dxa"/>
+          </w:tcPr>
+          <w:p>
+            <w:pPr>
+              <w:rPr>
+                <w:highlight w:val="yellow"/>
+                <w:lang w:val="en-US"/>
+              </w:rPr>
+            </w:pPr>
+            <w:r>
+              <w:rPr>
+                <w:highlight w:val="yellow"/>
+                <w:lang w:val="en-US"/>
+              </w:rPr>
+              <w:t xml:space="preserve">{{ </w:t>
+            </w:r>
+            <w:proofErr w:type="spellStart"/>
+            <w:r>
+              <w:rPr>
+                <w:highlight w:val="yellow"/>
+                <w:lang w:val="en-US"/>
+              </w:rPr>
+              <w:t>gost</w:t>
+            </w:r>
+            <w:proofErr w:type="spellEnd"/>
+            <w:r>
+              <w:rPr>
+                <w:highlight w:val="yellow"/>
+                <w:lang w:val="en-US"/>
+              </w:rPr>
+              <w:t xml:space="preserve"> }}</w:t>
             </w:r>
           </w:p>
         </w:tc>
@@ -161,71 +237,135 @@
                 <w:highlight w:val="yellow"/>
                 <w:lang w:val="en-US"/>
               </w:rPr>
-              <w:t>{{ g_vvod }}</w:t>
-            </w:r>
-          </w:p>
-        </w:tc>
-        <w:tc>
-          <w:tcPr>
-            <w:tcW w:w="5341" w:type="dxa"/>
-          </w:tcPr>
-          <w:p>
-            <w:r>
-              <w:t>Дата ввода в экспл.</w:t>
-            </w:r>
-          </w:p>
-        </w:tc>
-      </w:tr>
-      <w:tr>
-        <w:tc>
-          <w:tcPr>
-            <w:tcW w:w="5341" w:type="dxa"/>
-          </w:tcPr>
-          <w:p>
-            <w:pPr>
-              <w:rPr>
-                <w:highlight w:val="yellow"/>
-                <w:lang w:val="en-US"/>
-              </w:rPr>
-            </w:pPr>
-            <w:r>
-              <w:rPr>
-                <w:highlight w:val="yellow"/>
-                <w:lang w:val="en-US"/>
-              </w:rPr>
-              <w:t>{{ dataZakl }}</w:t>
-            </w:r>
-          </w:p>
-        </w:tc>
-        <w:tc>
-          <w:tcPr>
-            <w:tcW w:w="5341" w:type="dxa"/>
-          </w:tcPr>
-          <w:p>
-            <w:r>
-              <w:t>Дата подписания закла???</w:t>
-            </w:r>
-          </w:p>
-        </w:tc>
-      </w:tr>
-      <w:tr>
-        <w:tc>
-          <w:tcPr>
-            <w:tcW w:w="5341" w:type="dxa"/>
-          </w:tcPr>
-          <w:p>
-            <w:pPr>
-              <w:rPr>
-                <w:highlight w:val="yellow"/>
-                <w:lang w:val="en-US"/>
-              </w:rPr>
-            </w:pPr>
-            <w:r>
-              <w:rPr>
-                <w:highlight w:val="yellow"/>
-                <w:lang w:val="en-US"/>
-              </w:rPr>
-              <w:t>{{ yearsOfExpluatation }}</w:t>
+              <w:t xml:space="preserve">{{ </w:t>
+            </w:r>
+            <w:proofErr w:type="spellStart"/>
+            <w:r>
+              <w:rPr>
+                <w:highlight w:val="yellow"/>
+                <w:lang w:val="en-US"/>
+              </w:rPr>
+              <w:t>g_vvod</w:t>
+            </w:r>
+            <w:proofErr w:type="spellEnd"/>
+            <w:r>
+              <w:rPr>
+                <w:highlight w:val="yellow"/>
+                <w:lang w:val="en-US"/>
+              </w:rPr>
+              <w:t xml:space="preserve"> }}</w:t>
+            </w:r>
+          </w:p>
+        </w:tc>
+        <w:tc>
+          <w:tcPr>
+            <w:tcW w:w="5341" w:type="dxa"/>
+          </w:tcPr>
+          <w:p>
+            <w:r>
+              <w:t xml:space="preserve">Дата ввода в </w:t>
+            </w:r>
+            <w:proofErr w:type="spellStart"/>
+            <w:r>
+              <w:t>экспл</w:t>
+            </w:r>
+            <w:proofErr w:type="spellEnd"/>
+            <w:r>
+              <w:t>.</w:t>
+            </w:r>
+          </w:p>
+        </w:tc>
+      </w:tr>
+      <w:tr>
+        <w:tc>
+          <w:tcPr>
+            <w:tcW w:w="5341" w:type="dxa"/>
+          </w:tcPr>
+          <w:p>
+            <w:pPr>
+              <w:rPr>
+                <w:highlight w:val="yellow"/>
+                <w:lang w:val="en-US"/>
+              </w:rPr>
+            </w:pPr>
+            <w:r>
+              <w:rPr>
+                <w:highlight w:val="yellow"/>
+                <w:lang w:val="en-US"/>
+              </w:rPr>
+              <w:t xml:space="preserve">{{ </w:t>
+            </w:r>
+            <w:proofErr w:type="spellStart"/>
+            <w:r>
+              <w:rPr>
+                <w:highlight w:val="yellow"/>
+                <w:lang w:val="en-US"/>
+              </w:rPr>
+              <w:t>dataZakl</w:t>
+            </w:r>
+            <w:proofErr w:type="spellEnd"/>
+            <w:r>
+              <w:rPr>
+                <w:highlight w:val="yellow"/>
+                <w:lang w:val="en-US"/>
+              </w:rPr>
+              <w:t xml:space="preserve"> }}</w:t>
+            </w:r>
+          </w:p>
+        </w:tc>
+        <w:tc>
+          <w:tcPr>
+            <w:tcW w:w="5341" w:type="dxa"/>
+          </w:tcPr>
+          <w:p>
+            <w:r>
+              <w:t xml:space="preserve">Дата подписания </w:t>
+            </w:r>
+            <w:proofErr w:type="spellStart"/>
+            <w:r>
+              <w:t>закла</w:t>
+            </w:r>
+            <w:proofErr w:type="spellEnd"/>
+            <w:r>
+              <w:t>???</w:t>
+            </w:r>
+          </w:p>
+        </w:tc>
+      </w:tr>
+      <w:tr>
+        <w:tc>
+          <w:tcPr>
+            <w:tcW w:w="5341" w:type="dxa"/>
+          </w:tcPr>
+          <w:p>
+            <w:pPr>
+              <w:rPr>
+                <w:highlight w:val="yellow"/>
+                <w:lang w:val="en-US"/>
+              </w:rPr>
+            </w:pPr>
+            <w:r>
+              <w:rPr>
+                <w:highlight w:val="yellow"/>
+                <w:lang w:val="en-US"/>
+              </w:rPr>
+              <w:t xml:space="preserve">{{ </w:t>
+            </w:r>
+            <w:proofErr w:type="spellStart"/>
+            <w:r>
+              <w:rPr>
+                <w:highlight w:val="yellow"/>
+                <w:lang w:val="en-US"/>
+              </w:rPr>
+              <w:t>yearsOfExpluatation</w:t>
+            </w:r>
+            <w:proofErr w:type="spellEnd"/>
+            <w:r>
+              <w:rPr>
+                <w:highlight w:val="yellow"/>
+                <w:lang w:val="en-US"/>
+              </w:rPr>
+              <w:t xml:space="preserve"> }}</w:t>
             </w:r>
           </w:p>
         </w:tc>
@@ -257,7 +397,23 @@
                 <w:highlight w:val="yellow"/>
                 <w:lang w:val="en-US"/>
               </w:rPr>
-              <w:t>{{ min_year }}</w:t>
+              <w:t xml:space="preserve">{{ </w:t>
+            </w:r>
+            <w:proofErr w:type="spellStart"/>
+            <w:r>
+              <w:rPr>
+                <w:highlight w:val="yellow"/>
+                <w:lang w:val="en-US"/>
+              </w:rPr>
+              <w:t>min_year</w:t>
+            </w:r>
+            <w:proofErr w:type="spellEnd"/>
+            <w:r>
+              <w:rPr>
+                <w:highlight w:val="yellow"/>
+                <w:lang w:val="en-US"/>
+              </w:rPr>
+              <w:t xml:space="preserve"> }}</w:t>
             </w:r>
           </w:p>
         </w:tc>
@@ -289,7 +445,23 @@
                 <w:highlight w:val="yellow"/>
                 <w:lang w:val="en-US"/>
               </w:rPr>
-              <w:t>{{ max_year }}</w:t>
+              <w:t xml:space="preserve">{{ </w:t>
+            </w:r>
+            <w:proofErr w:type="spellStart"/>
+            <w:r>
+              <w:rPr>
+                <w:highlight w:val="yellow"/>
+                <w:lang w:val="en-US"/>
+              </w:rPr>
+              <w:t>max_year</w:t>
+            </w:r>
+            <w:proofErr w:type="spellEnd"/>
+            <w:r>
+              <w:rPr>
+                <w:highlight w:val="yellow"/>
+                <w:lang w:val="en-US"/>
+              </w:rPr>
+              <w:t xml:space="preserve"> }}</w:t>
             </w:r>
           </w:p>
         </w:tc>
@@ -321,7 +493,23 @@
                 <w:highlight w:val="yellow"/>
                 <w:lang w:val="en-US"/>
               </w:rPr>
-              <w:t>{{ chertezh }}</w:t>
+              <w:t xml:space="preserve">{{ </w:t>
+            </w:r>
+            <w:proofErr w:type="spellStart"/>
+            <w:r>
+              <w:rPr>
+                <w:highlight w:val="yellow"/>
+                <w:lang w:val="en-US"/>
+              </w:rPr>
+              <w:t>chertezh</w:t>
+            </w:r>
+            <w:proofErr w:type="spellEnd"/>
+            <w:r>
+              <w:rPr>
+                <w:highlight w:val="yellow"/>
+                <w:lang w:val="en-US"/>
+              </w:rPr>
+              <w:t xml:space="preserve"> }}</w:t>
             </w:r>
           </w:p>
         </w:tc>
@@ -358,7 +546,23 @@
                 <w:highlight w:val="yellow"/>
                 <w:lang w:val="en-US"/>
               </w:rPr>
-              <w:t>{{ p_rasch }}</w:t>
+              <w:t xml:space="preserve">{{ </w:t>
+            </w:r>
+            <w:proofErr w:type="spellStart"/>
+            <w:r>
+              <w:rPr>
+                <w:highlight w:val="yellow"/>
+                <w:lang w:val="en-US"/>
+              </w:rPr>
+              <w:t>p_rasch</w:t>
+            </w:r>
+            <w:proofErr w:type="spellEnd"/>
+            <w:r>
+              <w:rPr>
+                <w:highlight w:val="yellow"/>
+                <w:lang w:val="en-US"/>
+              </w:rPr>
+              <w:t xml:space="preserve"> }}</w:t>
             </w:r>
           </w:p>
         </w:tc>
@@ -390,7 +594,23 @@
                 <w:highlight w:val="yellow"/>
                 <w:lang w:val="en-US"/>
               </w:rPr>
-              <w:t>{{ p_rab }}</w:t>
+              <w:t xml:space="preserve">{{ </w:t>
+            </w:r>
+            <w:proofErr w:type="spellStart"/>
+            <w:r>
+              <w:rPr>
+                <w:highlight w:val="yellow"/>
+                <w:lang w:val="en-US"/>
+              </w:rPr>
+              <w:t>p_rab</w:t>
+            </w:r>
+            <w:proofErr w:type="spellEnd"/>
+            <w:r>
+              <w:rPr>
+                <w:highlight w:val="yellow"/>
+                <w:lang w:val="en-US"/>
+              </w:rPr>
+              <w:t xml:space="preserve"> }}</w:t>
             </w:r>
           </w:p>
         </w:tc>
@@ -554,7 +774,78 @@
                 <w:highlight w:val="yellow"/>
                 <w:lang w:val="en-US"/>
               </w:rPr>
-              <w:t>{{ s_isp }}</w:t>
+              <w:t xml:space="preserve">{{ </w:t>
+            </w:r>
+            <w:proofErr w:type="spellStart"/>
+            <w:r>
+              <w:rPr>
+                <w:highlight w:val="yellow"/>
+                <w:lang w:val="en-US"/>
+              </w:rPr>
+              <w:t>pasp_pg_amount</w:t>
+            </w:r>
+            <w:proofErr w:type="spellEnd"/>
+            <w:r>
+              <w:rPr>
+                <w:highlight w:val="yellow"/>
+                <w:lang w:val="en-US"/>
+              </w:rPr>
+              <w:t xml:space="preserve"> }}</w:t>
+            </w:r>
+          </w:p>
+        </w:tc>
+        <w:tc>
+          <w:tcPr>
+            <w:tcW w:w="5341" w:type="dxa"/>
+          </w:tcPr>
+          <w:p>
+            <w:pPr>
+              <w:tabs>
+                <w:tab w:val="left" w:pos="3090"/>
+              </w:tabs>
+            </w:pPr>
+            <w:r>
+              <w:t>Количество листов в паспорте.</w:t>
+            </w:r>
+            <w:bookmarkStart w:id="0" w:name="_GoBack"/>
+            <w:bookmarkEnd w:id="0"/>
+          </w:p>
+        </w:tc>
+      </w:tr>
+      <w:tr>
+        <w:tc>
+          <w:tcPr>
+            <w:tcW w:w="5341" w:type="dxa"/>
+          </w:tcPr>
+          <w:p>
+            <w:pPr>
+              <w:rPr>
+                <w:highlight w:val="yellow"/>
+                <w:lang w:val="en-US"/>
+              </w:rPr>
+            </w:pPr>
+            <w:r>
+              <w:rPr>
+                <w:highlight w:val="yellow"/>
+                <w:lang w:val="en-US"/>
+              </w:rPr>
+              <w:t xml:space="preserve">{{ </w:t>
+            </w:r>
+            <w:proofErr w:type="spellStart"/>
+            <w:r>
+              <w:rPr>
+                <w:highlight w:val="yellow"/>
+                <w:lang w:val="en-US"/>
+              </w:rPr>
+              <w:t>s_isp</w:t>
+            </w:r>
+            <w:proofErr w:type="spellEnd"/>
+            <w:r>
+              <w:rPr>
+                <w:highlight w:val="yellow"/>
+                <w:lang w:val="en-US"/>
+              </w:rPr>
+              <w:t xml:space="preserve"> }}</w:t>
             </w:r>
           </w:p>
         </w:tc>
@@ -618,7 +909,23 @@
                 <w:highlight w:val="yellow"/>
                 <w:lang w:val="en-US"/>
               </w:rPr>
-              <w:t>{{ d_nar }}</w:t>
+              <w:t xml:space="preserve">{{ </w:t>
+            </w:r>
+            <w:proofErr w:type="spellStart"/>
+            <w:r>
+              <w:rPr>
+                <w:highlight w:val="yellow"/>
+                <w:lang w:val="en-US"/>
+              </w:rPr>
+              <w:t>d_nar</w:t>
+            </w:r>
+            <w:proofErr w:type="spellEnd"/>
+            <w:r>
+              <w:rPr>
+                <w:highlight w:val="yellow"/>
+                <w:lang w:val="en-US"/>
+              </w:rPr>
+              <w:t xml:space="preserve"> }}</w:t>
             </w:r>
           </w:p>
         </w:tc>
@@ -650,7 +957,23 @@
                 <w:highlight w:val="yellow"/>
                 <w:lang w:val="en-US"/>
               </w:rPr>
-              <w:t>{{ d_min }}</w:t>
+              <w:t xml:space="preserve">{{ </w:t>
+            </w:r>
+            <w:proofErr w:type="spellStart"/>
+            <w:r>
+              <w:rPr>
+                <w:highlight w:val="yellow"/>
+                <w:lang w:val="en-US"/>
+              </w:rPr>
+              <w:t>d_min</w:t>
+            </w:r>
+            <w:proofErr w:type="spellEnd"/>
+            <w:r>
+              <w:rPr>
+                <w:highlight w:val="yellow"/>
+                <w:lang w:val="en-US"/>
+              </w:rPr>
+              <w:t xml:space="preserve"> }}</w:t>
             </w:r>
           </w:p>
         </w:tc>
@@ -682,7 +1005,23 @@
                 <w:highlight w:val="yellow"/>
                 <w:lang w:val="en-US"/>
               </w:rPr>
-              <w:t>{{ d_max }}</w:t>
+              <w:t xml:space="preserve">{{ </w:t>
+            </w:r>
+            <w:proofErr w:type="spellStart"/>
+            <w:r>
+              <w:rPr>
+                <w:highlight w:val="yellow"/>
+                <w:lang w:val="en-US"/>
+              </w:rPr>
+              <w:t>d_max</w:t>
+            </w:r>
+            <w:proofErr w:type="spellEnd"/>
+            <w:r>
+              <w:rPr>
+                <w:highlight w:val="yellow"/>
+                <w:lang w:val="en-US"/>
+              </w:rPr>
+              <w:t xml:space="preserve"> }}</w:t>
             </w:r>
           </w:p>
         </w:tc>
@@ -753,8 +1092,17 @@
                 <w:highlight w:val="yellow"/>
                 <w:lang w:val="en-US"/>
               </w:rPr>
-              <w:t xml:space="preserve"> volume_total</w:t>
-            </w:r>
+              <w:t xml:space="preserve"> </w:t>
+            </w:r>
+            <w:proofErr w:type="spellStart"/>
+            <w:r>
+              <w:rPr>
+                <w:highlight w:val="yellow"/>
+                <w:lang w:val="en-US"/>
+              </w:rPr>
+              <w:t>volume_total</w:t>
+            </w:r>
+            <w:proofErr w:type="spellEnd"/>
             <w:r>
               <w:rPr>
                 <w:highlight w:val="yellow"/>
@@ -792,7 +1140,23 @@
                 <w:highlight w:val="yellow"/>
                 <w:lang w:val="en-US"/>
               </w:rPr>
-              <w:t>{{ zav_nums }}</w:t>
+              <w:t xml:space="preserve">{{ </w:t>
+            </w:r>
+            <w:proofErr w:type="spellStart"/>
+            <w:r>
+              <w:rPr>
+                <w:highlight w:val="yellow"/>
+                <w:lang w:val="en-US"/>
+              </w:rPr>
+              <w:t>zav_nums</w:t>
+            </w:r>
+            <w:proofErr w:type="spellEnd"/>
+            <w:r>
+              <w:rPr>
+                <w:highlight w:val="yellow"/>
+                <w:lang w:val="en-US"/>
+              </w:rPr>
+              <w:t xml:space="preserve"> }}</w:t>
             </w:r>
           </w:p>
         </w:tc>
@@ -824,17 +1188,38 @@
                 <w:highlight w:val="yellow"/>
                 <w:lang w:val="en-US"/>
               </w:rPr>
-              <w:t>{{ reg_nums }}</w:t>
-            </w:r>
-          </w:p>
-        </w:tc>
-        <w:tc>
-          <w:tcPr>
-            <w:tcW w:w="5341" w:type="dxa"/>
-          </w:tcPr>
-          <w:p>
-            <w:r>
-              <w:t>Рег номера баллонов.</w:t>
+              <w:t xml:space="preserve">{{ </w:t>
+            </w:r>
+            <w:proofErr w:type="spellStart"/>
+            <w:r>
+              <w:rPr>
+                <w:highlight w:val="yellow"/>
+                <w:lang w:val="en-US"/>
+              </w:rPr>
+              <w:t>reg_nums</w:t>
+            </w:r>
+            <w:proofErr w:type="spellEnd"/>
+            <w:r>
+              <w:rPr>
+                <w:highlight w:val="yellow"/>
+                <w:lang w:val="en-US"/>
+              </w:rPr>
+              <w:t xml:space="preserve"> }}</w:t>
+            </w:r>
+          </w:p>
+        </w:tc>
+        <w:tc>
+          <w:tcPr>
+            <w:tcW w:w="5341" w:type="dxa"/>
+          </w:tcPr>
+          <w:p>
+            <w:proofErr w:type="spellStart"/>
+            <w:r>
+              <w:t>Рег</w:t>
+            </w:r>
+            <w:proofErr w:type="spellEnd"/>
+            <w:r>
+              <w:t xml:space="preserve"> номера баллонов.</w:t>
             </w:r>
           </w:p>
         </w:tc>
@@ -897,7 +1282,23 @@
                 <w:highlight w:val="yellow"/>
                 <w:lang w:val="en-US"/>
               </w:rPr>
-              <w:t>{{ place_obj }}</w:t>
+              <w:t xml:space="preserve">{{ </w:t>
+            </w:r>
+            <w:proofErr w:type="spellStart"/>
+            <w:r>
+              <w:rPr>
+                <w:highlight w:val="yellow"/>
+                <w:lang w:val="en-US"/>
+              </w:rPr>
+              <w:t>place_obj</w:t>
+            </w:r>
+            <w:proofErr w:type="spellEnd"/>
+            <w:r>
+              <w:rPr>
+                <w:highlight w:val="yellow"/>
+                <w:lang w:val="en-US"/>
+              </w:rPr>
+              <w:t xml:space="preserve"> }}</w:t>
             </w:r>
           </w:p>
         </w:tc>
@@ -929,7 +1330,23 @@
                 <w:highlight w:val="yellow"/>
                 <w:lang w:val="en-US"/>
               </w:rPr>
-              <w:t>{{ zavod_name }}</w:t>
+              <w:t xml:space="preserve">{{ </w:t>
+            </w:r>
+            <w:proofErr w:type="spellStart"/>
+            <w:r>
+              <w:rPr>
+                <w:highlight w:val="yellow"/>
+                <w:lang w:val="en-US"/>
+              </w:rPr>
+              <w:t>zavod_name</w:t>
+            </w:r>
+            <w:proofErr w:type="spellEnd"/>
+            <w:r>
+              <w:rPr>
+                <w:highlight w:val="yellow"/>
+                <w:lang w:val="en-US"/>
+              </w:rPr>
+              <w:t xml:space="preserve"> }}</w:t>
             </w:r>
           </w:p>
         </w:tc>
@@ -1028,7 +1445,23 @@
                 <w:highlight w:val="yellow"/>
                 <w:lang w:val="en-US"/>
               </w:rPr>
-              <w:t>{{ rab_sreda }}</w:t>
+              <w:t xml:space="preserve">{{ </w:t>
+            </w:r>
+            <w:proofErr w:type="spellStart"/>
+            <w:r>
+              <w:rPr>
+                <w:highlight w:val="yellow"/>
+                <w:lang w:val="en-US"/>
+              </w:rPr>
+              <w:t>rab_sreda</w:t>
+            </w:r>
+            <w:proofErr w:type="spellEnd"/>
+            <w:r>
+              <w:rPr>
+                <w:highlight w:val="yellow"/>
+                <w:lang w:val="en-US"/>
+              </w:rPr>
+              <w:t xml:space="preserve"> }}</w:t>
             </w:r>
           </w:p>
         </w:tc>
@@ -1060,7 +1493,23 @@
                 <w:highlight w:val="yellow"/>
                 <w:lang w:val="en-US"/>
               </w:rPr>
-              <w:t>{{ vladelec }}</w:t>
+              <w:t xml:space="preserve">{{ </w:t>
+            </w:r>
+            <w:proofErr w:type="spellStart"/>
+            <w:r>
+              <w:rPr>
+                <w:highlight w:val="yellow"/>
+                <w:lang w:val="en-US"/>
+              </w:rPr>
+              <w:t>vladelec</w:t>
+            </w:r>
+            <w:proofErr w:type="spellEnd"/>
+            <w:r>
+              <w:rPr>
+                <w:highlight w:val="yellow"/>
+                <w:lang w:val="en-US"/>
+              </w:rPr>
+              <w:t xml:space="preserve"> }}</w:t>
             </w:r>
           </w:p>
         </w:tc>
@@ -1092,7 +1541,23 @@
                 <w:highlight w:val="yellow"/>
                 <w:lang w:val="en-US"/>
               </w:rPr>
-              <w:t>{{ vik_date }}</w:t>
+              <w:t xml:space="preserve">{{ </w:t>
+            </w:r>
+            <w:proofErr w:type="spellStart"/>
+            <w:r>
+              <w:rPr>
+                <w:highlight w:val="yellow"/>
+                <w:lang w:val="en-US"/>
+              </w:rPr>
+              <w:t>vik_date</w:t>
+            </w:r>
+            <w:proofErr w:type="spellEnd"/>
+            <w:r>
+              <w:rPr>
+                <w:highlight w:val="yellow"/>
+                <w:lang w:val="en-US"/>
+              </w:rPr>
+              <w:t xml:space="preserve"> }}</w:t>
             </w:r>
           </w:p>
         </w:tc>
@@ -1124,7 +1589,23 @@
                 <w:highlight w:val="yellow"/>
                 <w:lang w:val="en-US"/>
               </w:rPr>
-              <w:t>{{ tolshTverdost_date }}</w:t>
+              <w:t xml:space="preserve">{{ </w:t>
+            </w:r>
+            <w:proofErr w:type="spellStart"/>
+            <w:r>
+              <w:rPr>
+                <w:highlight w:val="yellow"/>
+                <w:lang w:val="en-US"/>
+              </w:rPr>
+              <w:t>tolshTverdost_date</w:t>
+            </w:r>
+            <w:proofErr w:type="spellEnd"/>
+            <w:r>
+              <w:rPr>
+                <w:highlight w:val="yellow"/>
+                <w:lang w:val="en-US"/>
+              </w:rPr>
+              <w:t xml:space="preserve"> }}</w:t>
             </w:r>
           </w:p>
         </w:tc>
@@ -1161,7 +1642,23 @@
                 <w:highlight w:val="yellow"/>
                 <w:lang w:val="en-US"/>
               </w:rPr>
-              <w:t>{{ ispRasch_date }}</w:t>
+              <w:t xml:space="preserve">{{ </w:t>
+            </w:r>
+            <w:proofErr w:type="spellStart"/>
+            <w:r>
+              <w:rPr>
+                <w:highlight w:val="yellow"/>
+                <w:lang w:val="en-US"/>
+              </w:rPr>
+              <w:t>ispRasch_date</w:t>
+            </w:r>
+            <w:proofErr w:type="spellEnd"/>
+            <w:r>
+              <w:rPr>
+                <w:highlight w:val="yellow"/>
+                <w:lang w:val="en-US"/>
+              </w:rPr>
+              <w:t xml:space="preserve"> }}</w:t>
             </w:r>
           </w:p>
         </w:tc>
@@ -1198,7 +1695,23 @@
                 <w:highlight w:val="yellow"/>
                 <w:lang w:val="en-US"/>
               </w:rPr>
-              <w:t>{{ prodlEPB_date }}</w:t>
+              <w:t xml:space="preserve">{{ </w:t>
+            </w:r>
+            <w:proofErr w:type="spellStart"/>
+            <w:r>
+              <w:rPr>
+                <w:highlight w:val="yellow"/>
+                <w:lang w:val="en-US"/>
+              </w:rPr>
+              <w:t>prodlEPB_date</w:t>
+            </w:r>
+            <w:proofErr w:type="spellEnd"/>
+            <w:r>
+              <w:rPr>
+                <w:highlight w:val="yellow"/>
+                <w:lang w:val="en-US"/>
+              </w:rPr>
+              <w:t xml:space="preserve"> }}</w:t>
             </w:r>
           </w:p>
         </w:tc>
@@ -1235,7 +1748,23 @@
                 <w:highlight w:val="yellow"/>
                 <w:lang w:val="en-US"/>
               </w:rPr>
-              <w:t>{{ prodlTO_date }}</w:t>
+              <w:t xml:space="preserve">{{ </w:t>
+            </w:r>
+            <w:proofErr w:type="spellStart"/>
+            <w:r>
+              <w:rPr>
+                <w:highlight w:val="yellow"/>
+                <w:lang w:val="en-US"/>
+              </w:rPr>
+              <w:t>prodlTO_date</w:t>
+            </w:r>
+            <w:proofErr w:type="spellEnd"/>
+            <w:r>
+              <w:rPr>
+                <w:highlight w:val="yellow"/>
+                <w:lang w:val="en-US"/>
+              </w:rPr>
+              <w:t xml:space="preserve"> }}</w:t>
             </w:r>
           </w:p>
         </w:tc>
@@ -1272,7 +1801,23 @@
                 <w:highlight w:val="yellow"/>
                 <w:lang w:val="en-US"/>
               </w:rPr>
-              <w:t>{{ dogContract }}</w:t>
+              <w:t xml:space="preserve">{{ </w:t>
+            </w:r>
+            <w:proofErr w:type="spellStart"/>
+            <w:r>
+              <w:rPr>
+                <w:highlight w:val="yellow"/>
+                <w:lang w:val="en-US"/>
+              </w:rPr>
+              <w:t>dogContract</w:t>
+            </w:r>
+            <w:proofErr w:type="spellEnd"/>
+            <w:r>
+              <w:rPr>
+                <w:highlight w:val="yellow"/>
+                <w:lang w:val="en-US"/>
+              </w:rPr>
+              <w:t xml:space="preserve"> }}</w:t>
             </w:r>
           </w:p>
         </w:tc>
@@ -1304,7 +1849,23 @@
                 <w:highlight w:val="yellow"/>
                 <w:lang w:val="en-US"/>
               </w:rPr>
-              <w:t>{{ pricaz_contora }}</w:t>
+              <w:t xml:space="preserve">{{ </w:t>
+            </w:r>
+            <w:proofErr w:type="spellStart"/>
+            <w:r>
+              <w:rPr>
+                <w:highlight w:val="yellow"/>
+                <w:lang w:val="en-US"/>
+              </w:rPr>
+              <w:t>pricaz_contora</w:t>
+            </w:r>
+            <w:proofErr w:type="spellEnd"/>
+            <w:r>
+              <w:rPr>
+                <w:highlight w:val="yellow"/>
+                <w:lang w:val="en-US"/>
+              </w:rPr>
+              <w:t xml:space="preserve"> }}</w:t>
             </w:r>
           </w:p>
         </w:tc>
@@ -1335,7 +1896,23 @@
                 <w:highlight w:val="yellow"/>
                 <w:lang w:val="en-US"/>
               </w:rPr>
-              <w:t>{{ pricaz_vladelec }}</w:t>
+              <w:t xml:space="preserve">{{ </w:t>
+            </w:r>
+            <w:proofErr w:type="spellStart"/>
+            <w:r>
+              <w:rPr>
+                <w:highlight w:val="yellow"/>
+                <w:lang w:val="en-US"/>
+              </w:rPr>
+              <w:t>pricaz_vladelec</w:t>
+            </w:r>
+            <w:proofErr w:type="spellEnd"/>
+            <w:r>
+              <w:rPr>
+                <w:highlight w:val="yellow"/>
+                <w:lang w:val="en-US"/>
+              </w:rPr>
+              <w:t xml:space="preserve"> }}</w:t>
             </w:r>
           </w:p>
         </w:tc>
@@ -1367,7 +1944,23 @@
                 <w:highlight w:val="yellow"/>
                 <w:lang w:val="en-US"/>
               </w:rPr>
-              <w:t>{{ naznach }}</w:t>
+              <w:t xml:space="preserve">{{ </w:t>
+            </w:r>
+            <w:proofErr w:type="spellStart"/>
+            <w:r>
+              <w:rPr>
+                <w:highlight w:val="yellow"/>
+                <w:lang w:val="en-US"/>
+              </w:rPr>
+              <w:t>naznach</w:t>
+            </w:r>
+            <w:proofErr w:type="spellEnd"/>
+            <w:r>
+              <w:rPr>
+                <w:highlight w:val="yellow"/>
+                <w:lang w:val="en-US"/>
+              </w:rPr>
+              <w:t xml:space="preserve"> }}</w:t>
             </w:r>
           </w:p>
         </w:tc>
@@ -1431,7 +2024,23 @@
                 <w:highlight w:val="yellow"/>
                 <w:lang w:val="en-US"/>
               </w:rPr>
-              <w:t>{{ s_min_total }}</w:t>
+              <w:t xml:space="preserve">{{ </w:t>
+            </w:r>
+            <w:proofErr w:type="spellStart"/>
+            <w:r>
+              <w:rPr>
+                <w:highlight w:val="yellow"/>
+                <w:lang w:val="en-US"/>
+              </w:rPr>
+              <w:t>s_min_total</w:t>
+            </w:r>
+            <w:proofErr w:type="spellEnd"/>
+            <w:r>
+              <w:rPr>
+                <w:highlight w:val="yellow"/>
+                <w:lang w:val="en-US"/>
+              </w:rPr>
+              <w:t xml:space="preserve"> }}</w:t>
             </w:r>
           </w:p>
         </w:tc>
@@ -1468,7 +2077,21 @@
               <w:rPr>
                 <w:highlight w:val="yellow"/>
               </w:rPr>
-              <w:t xml:space="preserve"> zav_s_min </w:t>
+              <w:t xml:space="preserve"> </w:t>
+            </w:r>
+            <w:proofErr w:type="spellStart"/>
+            <w:r>
+              <w:rPr>
+                <w:highlight w:val="yellow"/>
+              </w:rPr>
+              <w:t>zav_s_min</w:t>
+            </w:r>
+            <w:proofErr w:type="spellEnd"/>
+            <w:r>
+              <w:rPr>
+                <w:highlight w:val="yellow"/>
+              </w:rPr>
+              <w:t xml:space="preserve"> </w:t>
             </w:r>
             <w:r>
               <w:rPr>
@@ -1512,7 +2135,21 @@
               <w:rPr>
                 <w:highlight w:val="yellow"/>
               </w:rPr>
-              <w:t xml:space="preserve"> obj_name </w:t>
+              <w:t xml:space="preserve"> </w:t>
+            </w:r>
+            <w:proofErr w:type="spellStart"/>
+            <w:r>
+              <w:rPr>
+                <w:highlight w:val="yellow"/>
+              </w:rPr>
+              <w:t>obj_name</w:t>
+            </w:r>
+            <w:proofErr w:type="spellEnd"/>
+            <w:r>
+              <w:rPr>
+                <w:highlight w:val="yellow"/>
+              </w:rPr>
+              <w:t xml:space="preserve"> </w:t>
             </w:r>
             <w:r>
               <w:rPr>
@@ -1556,7 +2193,21 @@
               <w:rPr>
                 <w:highlight w:val="yellow"/>
               </w:rPr>
-              <w:t xml:space="preserve"> prev_zakl </w:t>
+              <w:t xml:space="preserve"> </w:t>
+            </w:r>
+            <w:proofErr w:type="spellStart"/>
+            <w:r>
+              <w:rPr>
+                <w:highlight w:val="yellow"/>
+              </w:rPr>
+              <w:t>prev_zakl</w:t>
+            </w:r>
+            <w:proofErr w:type="spellEnd"/>
+            <w:r>
+              <w:rPr>
+                <w:highlight w:val="yellow"/>
+              </w:rPr>
+              <w:t xml:space="preserve"> </w:t>
             </w:r>
             <w:r>
               <w:rPr>
@@ -1608,7 +2259,21 @@
               <w:rPr>
                 <w:highlight w:val="yellow"/>
               </w:rPr>
-              <w:t xml:space="preserve"> prev_pg_am </w:t>
+              <w:t xml:space="preserve"> </w:t>
+            </w:r>
+            <w:proofErr w:type="spellStart"/>
+            <w:r>
+              <w:rPr>
+                <w:highlight w:val="yellow"/>
+              </w:rPr>
+              <w:t>prev_pg_am</w:t>
+            </w:r>
+            <w:proofErr w:type="spellEnd"/>
+            <w:r>
+              <w:rPr>
+                <w:highlight w:val="yellow"/>
+              </w:rPr>
+              <w:t xml:space="preserve"> </w:t>
             </w:r>
             <w:r>
               <w:rPr>
@@ -1637,8 +2302,13 @@
       </w:tr>
     </w:tbl>
     <w:p>
+      <w:proofErr w:type="spellStart"/>
       <w:r>
-        <w:t>Плейсхолдеры для расчёта на прочность.</w:t>
+        <w:t>Плейсхолдеры</w:t>
+      </w:r>
+      <w:proofErr w:type="spellEnd"/>
+      <w:r>
+        <w:t xml:space="preserve"> для расчёта на прочность.</w:t>
       </w:r>
     </w:p>
     <w:tbl>
@@ -1657,9 +2327,11 @@
             <w:tcW w:w="5341" w:type="dxa"/>
           </w:tcPr>
           <w:p>
+            <w:proofErr w:type="spellStart"/>
             <w:r>
               <w:t>Плейсхолдер</w:t>
             </w:r>
+            <w:proofErr w:type="spellEnd"/>
           </w:p>
         </w:tc>
         <w:tc>
@@ -1703,6 +2375,7 @@
               </w:rPr>
               <w:t>_</w:t>
             </w:r>
+            <w:proofErr w:type="spellStart"/>
             <w:r>
               <w:rPr>
                 <w:highlight w:val="green"/>
@@ -1710,6 +2383,7 @@
               </w:rPr>
               <w:t>rab</w:t>
             </w:r>
+            <w:proofErr w:type="spellEnd"/>
             <w:r>
               <w:rPr>
                 <w:highlight w:val="green"/>
@@ -1772,6 +2446,7 @@
               </w:rPr>
               <w:t>_</w:t>
             </w:r>
+            <w:proofErr w:type="spellStart"/>
             <w:r>
               <w:rPr>
                 <w:highlight w:val="green"/>
@@ -1779,6 +2454,7 @@
               </w:rPr>
               <w:t>pnevma</w:t>
             </w:r>
+            <w:proofErr w:type="spellEnd"/>
             <w:r>
               <w:rPr>
                 <w:highlight w:val="green"/>
@@ -1818,7 +2494,24 @@
                 <w:highlight w:val="green"/>
                 <w:lang w:val="en-US"/>
               </w:rPr>
-              <w:t>{{ p_pnevma_kgs }}</w:t>
+              <w:lastRenderedPageBreak/>
+              <w:t xml:space="preserve">{{ </w:t>
+            </w:r>
+            <w:proofErr w:type="spellStart"/>
+            <w:r>
+              <w:rPr>
+                <w:highlight w:val="green"/>
+                <w:lang w:val="en-US"/>
+              </w:rPr>
+              <w:t>p_pnevma_kgs</w:t>
+            </w:r>
+            <w:proofErr w:type="spellEnd"/>
+            <w:r>
+              <w:rPr>
+                <w:highlight w:val="green"/>
+                <w:lang w:val="en-US"/>
+              </w:rPr>
+              <w:t xml:space="preserve"> }}</w:t>
             </w:r>
           </w:p>
         </w:tc>
@@ -1850,8 +2543,23 @@
                 <w:highlight w:val="green"/>
                 <w:lang w:val="en-US"/>
               </w:rPr>
-              <w:lastRenderedPageBreak/>
-              <w:t>{{ p_gidro }}</w:t>
+              <w:t xml:space="preserve">{{ </w:t>
+            </w:r>
+            <w:proofErr w:type="spellStart"/>
+            <w:r>
+              <w:rPr>
+                <w:highlight w:val="green"/>
+                <w:lang w:val="en-US"/>
+              </w:rPr>
+              <w:t>p_gidro</w:t>
+            </w:r>
+            <w:proofErr w:type="spellEnd"/>
+            <w:r>
+              <w:rPr>
+                <w:highlight w:val="green"/>
+                <w:lang w:val="en-US"/>
+              </w:rPr>
+              <w:t xml:space="preserve"> }}</w:t>
             </w:r>
           </w:p>
         </w:tc>
@@ -1883,7 +2591,23 @@
                 <w:highlight w:val="green"/>
                 <w:lang w:val="en-US"/>
               </w:rPr>
-              <w:t>{{ d_vnutr }}</w:t>
+              <w:t xml:space="preserve">{{ </w:t>
+            </w:r>
+            <w:proofErr w:type="spellStart"/>
+            <w:r>
+              <w:rPr>
+                <w:highlight w:val="green"/>
+                <w:lang w:val="en-US"/>
+              </w:rPr>
+              <w:t>d_vnutr</w:t>
+            </w:r>
+            <w:proofErr w:type="spellEnd"/>
+            <w:r>
+              <w:rPr>
+                <w:highlight w:val="green"/>
+                <w:lang w:val="en-US"/>
+              </w:rPr>
+              <w:t xml:space="preserve"> }}</w:t>
             </w:r>
           </w:p>
         </w:tc>
@@ -1915,7 +2639,23 @@
                 <w:highlight w:val="green"/>
                 <w:lang w:val="en-US"/>
               </w:rPr>
-              <w:t>{{ gost_material }}</w:t>
+              <w:t xml:space="preserve">{{ </w:t>
+            </w:r>
+            <w:proofErr w:type="spellStart"/>
+            <w:r>
+              <w:rPr>
+                <w:highlight w:val="green"/>
+                <w:lang w:val="en-US"/>
+              </w:rPr>
+              <w:t>gost_material</w:t>
+            </w:r>
+            <w:proofErr w:type="spellEnd"/>
+            <w:r>
+              <w:rPr>
+                <w:highlight w:val="green"/>
+                <w:lang w:val="en-US"/>
+              </w:rPr>
+              <w:t xml:space="preserve"> }}</w:t>
             </w:r>
           </w:p>
         </w:tc>
@@ -1928,7 +2668,15 @@
               <w:t xml:space="preserve">ГОСТ, материал. Взять из </w:t>
             </w:r>
             <w:r>
-              <w:t>{{ gost }}</w:t>
+              <w:t xml:space="preserve">{{ </w:t>
+            </w:r>
+            <w:proofErr w:type="spellStart"/>
+            <w:r>
+              <w:t>gost</w:t>
+            </w:r>
+            <w:proofErr w:type="spellEnd"/>
+            <w:r>
+              <w:t xml:space="preserve"> }}</w:t>
             </w:r>
             <w:r>
               <w:t>.</w:t>
@@ -1953,7 +2701,23 @@
                 <w:highlight w:val="green"/>
                 <w:lang w:val="en-US"/>
               </w:rPr>
-              <w:t>{{ pred_tek_min }}</w:t>
+              <w:t xml:space="preserve">{{ </w:t>
+            </w:r>
+            <w:proofErr w:type="spellStart"/>
+            <w:r>
+              <w:rPr>
+                <w:highlight w:val="green"/>
+                <w:lang w:val="en-US"/>
+              </w:rPr>
+              <w:t>pred_tek_min</w:t>
+            </w:r>
+            <w:proofErr w:type="spellEnd"/>
+            <w:r>
+              <w:rPr>
+                <w:highlight w:val="green"/>
+                <w:lang w:val="en-US"/>
+              </w:rPr>
+              <w:t xml:space="preserve"> }}</w:t>
             </w:r>
           </w:p>
         </w:tc>
@@ -1985,7 +2749,23 @@
                 <w:highlight w:val="green"/>
                 <w:lang w:val="en-US"/>
               </w:rPr>
-              <w:t>{{ vrem_sopr_min }}</w:t>
+              <w:t xml:space="preserve">{{ </w:t>
+            </w:r>
+            <w:proofErr w:type="spellStart"/>
+            <w:r>
+              <w:rPr>
+                <w:highlight w:val="green"/>
+                <w:lang w:val="en-US"/>
+              </w:rPr>
+              <w:t>vrem_sopr_min</w:t>
+            </w:r>
+            <w:proofErr w:type="spellEnd"/>
+            <w:r>
+              <w:rPr>
+                <w:highlight w:val="green"/>
+                <w:lang w:val="en-US"/>
+              </w:rPr>
+              <w:t xml:space="preserve"> }}</w:t>
             </w:r>
           </w:p>
         </w:tc>
@@ -2049,39 +2829,79 @@
                 <w:highlight w:val="green"/>
                 <w:lang w:val="en-US"/>
               </w:rPr>
-              <w:t>{{ sigma_gidro }}</w:t>
-            </w:r>
-          </w:p>
-        </w:tc>
-        <w:tc>
-          <w:tcPr>
-            <w:tcW w:w="5341" w:type="dxa"/>
-          </w:tcPr>
-          <w:p>
-            <w:r>
-              <w:t>Допускаемое гидро напряжение.</w:t>
-            </w:r>
-          </w:p>
-        </w:tc>
-      </w:tr>
-      <w:tr>
-        <w:tc>
-          <w:tcPr>
-            <w:tcW w:w="5341" w:type="dxa"/>
-          </w:tcPr>
-          <w:p>
-            <w:pPr>
-              <w:rPr>
-                <w:highlight w:val="green"/>
-                <w:lang w:val="en-US"/>
-              </w:rPr>
-            </w:pPr>
-            <w:r>
-              <w:rPr>
-                <w:highlight w:val="green"/>
-                <w:lang w:val="en-US"/>
-              </w:rPr>
-              <w:t>{{ s_rasch }}</w:t>
+              <w:t xml:space="preserve">{{ </w:t>
+            </w:r>
+            <w:proofErr w:type="spellStart"/>
+            <w:r>
+              <w:rPr>
+                <w:highlight w:val="green"/>
+                <w:lang w:val="en-US"/>
+              </w:rPr>
+              <w:t>sigma_gidro</w:t>
+            </w:r>
+            <w:proofErr w:type="spellEnd"/>
+            <w:r>
+              <w:rPr>
+                <w:highlight w:val="green"/>
+                <w:lang w:val="en-US"/>
+              </w:rPr>
+              <w:t xml:space="preserve"> }}</w:t>
+            </w:r>
+          </w:p>
+        </w:tc>
+        <w:tc>
+          <w:tcPr>
+            <w:tcW w:w="5341" w:type="dxa"/>
+          </w:tcPr>
+          <w:p>
+            <w:r>
+              <w:t xml:space="preserve">Допускаемое </w:t>
+            </w:r>
+            <w:proofErr w:type="spellStart"/>
+            <w:r>
+              <w:t>гидро</w:t>
+            </w:r>
+            <w:proofErr w:type="spellEnd"/>
+            <w:r>
+              <w:t xml:space="preserve"> напряжение.</w:t>
+            </w:r>
+          </w:p>
+        </w:tc>
+      </w:tr>
+      <w:tr>
+        <w:tc>
+          <w:tcPr>
+            <w:tcW w:w="5341" w:type="dxa"/>
+          </w:tcPr>
+          <w:p>
+            <w:pPr>
+              <w:rPr>
+                <w:highlight w:val="green"/>
+                <w:lang w:val="en-US"/>
+              </w:rPr>
+            </w:pPr>
+            <w:r>
+              <w:rPr>
+                <w:highlight w:val="green"/>
+                <w:lang w:val="en-US"/>
+              </w:rPr>
+              <w:t xml:space="preserve">{{ </w:t>
+            </w:r>
+            <w:proofErr w:type="spellStart"/>
+            <w:r>
+              <w:rPr>
+                <w:highlight w:val="green"/>
+                <w:lang w:val="en-US"/>
+              </w:rPr>
+              <w:t>s_rasch</w:t>
+            </w:r>
+            <w:proofErr w:type="spellEnd"/>
+            <w:r>
+              <w:rPr>
+                <w:highlight w:val="green"/>
+                <w:lang w:val="en-US"/>
+              </w:rPr>
+              <w:t xml:space="preserve"> }}</w:t>
             </w:r>
           </w:p>
         </w:tc>
@@ -2119,7 +2939,23 @@
                 <w:highlight w:val="green"/>
                 <w:lang w:val="en-US"/>
               </w:rPr>
-              <w:t>{{ s_rasch_gidro }}</w:t>
+              <w:t xml:space="preserve">{{ </w:t>
+            </w:r>
+            <w:proofErr w:type="spellStart"/>
+            <w:r>
+              <w:rPr>
+                <w:highlight w:val="green"/>
+                <w:lang w:val="en-US"/>
+              </w:rPr>
+              <w:t>s_rasch_gidro</w:t>
+            </w:r>
+            <w:proofErr w:type="spellEnd"/>
+            <w:r>
+              <w:rPr>
+                <w:highlight w:val="green"/>
+                <w:lang w:val="en-US"/>
+              </w:rPr>
+              <w:t xml:space="preserve"> }}</w:t>
             </w:r>
           </w:p>
         </w:tc>
@@ -2135,29 +2971,53 @@
               <w:t xml:space="preserve">S </w:t>
             </w:r>
             <w:r>
-              <w:t>расчётное гидро.</w:t>
-            </w:r>
-          </w:p>
-        </w:tc>
-      </w:tr>
-      <w:tr>
-        <w:tc>
-          <w:tcPr>
-            <w:tcW w:w="5341" w:type="dxa"/>
-          </w:tcPr>
-          <w:p>
-            <w:pPr>
-              <w:rPr>
-                <w:highlight w:val="green"/>
-                <w:lang w:val="en-US"/>
-              </w:rPr>
-            </w:pPr>
-            <w:r>
-              <w:rPr>
-                <w:highlight w:val="green"/>
-                <w:lang w:val="en-US"/>
-              </w:rPr>
-              <w:t>{{ s_max_rasch }}</w:t>
+              <w:t xml:space="preserve">расчётное </w:t>
+            </w:r>
+            <w:proofErr w:type="spellStart"/>
+            <w:r>
+              <w:t>гидро</w:t>
+            </w:r>
+            <w:proofErr w:type="spellEnd"/>
+            <w:r>
+              <w:t>.</w:t>
+            </w:r>
+          </w:p>
+        </w:tc>
+      </w:tr>
+      <w:tr>
+        <w:tc>
+          <w:tcPr>
+            <w:tcW w:w="5341" w:type="dxa"/>
+          </w:tcPr>
+          <w:p>
+            <w:pPr>
+              <w:rPr>
+                <w:highlight w:val="green"/>
+                <w:lang w:val="en-US"/>
+              </w:rPr>
+            </w:pPr>
+            <w:r>
+              <w:rPr>
+                <w:highlight w:val="green"/>
+                <w:lang w:val="en-US"/>
+              </w:rPr>
+              <w:t xml:space="preserve">{{ </w:t>
+            </w:r>
+            <w:proofErr w:type="spellStart"/>
+            <w:r>
+              <w:rPr>
+                <w:highlight w:val="green"/>
+                <w:lang w:val="en-US"/>
+              </w:rPr>
+              <w:t>s_max_rasch</w:t>
+            </w:r>
+            <w:proofErr w:type="spellEnd"/>
+            <w:r>
+              <w:rPr>
+                <w:highlight w:val="green"/>
+                <w:lang w:val="en-US"/>
+              </w:rPr>
+              <w:t xml:space="preserve"> }}</w:t>
             </w:r>
           </w:p>
         </w:tc>
@@ -2181,8 +3041,13 @@
     </w:tbl>
     <w:p/>
     <w:p>
+      <w:proofErr w:type="spellStart"/>
       <w:r>
-        <w:t>Плейсхолдеры для расчёта остаточного ресурса.</w:t>
+        <w:t>Плейсхолдеры</w:t>
+      </w:r>
+      <w:proofErr w:type="spellEnd"/>
+      <w:r>
+        <w:t xml:space="preserve"> для расчёта остаточного ресурса.</w:t>
       </w:r>
     </w:p>
     <w:tbl>
@@ -2201,9 +3066,11 @@
             <w:tcW w:w="5341" w:type="dxa"/>
           </w:tcPr>
           <w:p>
+            <w:proofErr w:type="spellStart"/>
             <w:r>
               <w:t>Плейсхолдер</w:t>
             </w:r>
+            <w:proofErr w:type="spellEnd"/>
           </w:p>
         </w:tc>
         <w:tc>
@@ -2233,7 +3100,23 @@
                 <w:highlight w:val="magenta"/>
                 <w:lang w:val="en-US"/>
               </w:rPr>
-              <w:t>{{ a_corr }}</w:t>
+              <w:t xml:space="preserve">{{ </w:t>
+            </w:r>
+            <w:proofErr w:type="spellStart"/>
+            <w:r>
+              <w:rPr>
+                <w:highlight w:val="magenta"/>
+                <w:lang w:val="en-US"/>
+              </w:rPr>
+              <w:t>a_corr</w:t>
+            </w:r>
+            <w:proofErr w:type="spellEnd"/>
+            <w:r>
+              <w:rPr>
+                <w:highlight w:val="magenta"/>
+                <w:lang w:val="en-US"/>
+              </w:rPr>
+              <w:t xml:space="preserve"> }}</w:t>
             </w:r>
           </w:p>
         </w:tc>
@@ -2296,20 +3179,44 @@
                 <w:highlight w:val="magenta"/>
                 <w:lang w:val="en-US"/>
               </w:rPr>
-              <w:t>{{ tk_years }}</w:t>
-            </w:r>
-          </w:p>
-        </w:tc>
-        <w:tc>
-          <w:tcPr>
-            <w:tcW w:w="5341" w:type="dxa"/>
-          </w:tcPr>
-          <w:p>
-            <w:r>
-              <w:rPr>
-                <w:lang w:val="en-US"/>
-              </w:rPr>
-              <w:t xml:space="preserve">Tk </w:t>
+              <w:t xml:space="preserve">{{ </w:t>
+            </w:r>
+            <w:proofErr w:type="spellStart"/>
+            <w:r>
+              <w:rPr>
+                <w:highlight w:val="magenta"/>
+                <w:lang w:val="en-US"/>
+              </w:rPr>
+              <w:t>tk_years</w:t>
+            </w:r>
+            <w:proofErr w:type="spellEnd"/>
+            <w:r>
+              <w:rPr>
+                <w:highlight w:val="magenta"/>
+                <w:lang w:val="en-US"/>
+              </w:rPr>
+              <w:t xml:space="preserve"> }}</w:t>
+            </w:r>
+          </w:p>
+        </w:tc>
+        <w:tc>
+          <w:tcPr>
+            <w:tcW w:w="5341" w:type="dxa"/>
+          </w:tcPr>
+          <w:p>
+            <w:proofErr w:type="spellStart"/>
+            <w:r>
+              <w:rPr>
+                <w:lang w:val="en-US"/>
+              </w:rPr>
+              <w:t>Tk</w:t>
+            </w:r>
+            <w:proofErr w:type="spellEnd"/>
+            <w:r>
+              <w:rPr>
+                <w:lang w:val="en-US"/>
+              </w:rPr>
+              <w:t xml:space="preserve"> </w:t>
             </w:r>
             <w:r>
               <w:t>в годах.</w:t>
@@ -2334,7 +3241,23 @@
                 <w:highlight w:val="magenta"/>
                 <w:lang w:val="en-US"/>
               </w:rPr>
-              <w:t>{{ tk_just }}</w:t>
+              <w:t xml:space="preserve">{{ </w:t>
+            </w:r>
+            <w:proofErr w:type="spellStart"/>
+            <w:r>
+              <w:rPr>
+                <w:highlight w:val="magenta"/>
+                <w:lang w:val="en-US"/>
+              </w:rPr>
+              <w:t>tk_just</w:t>
+            </w:r>
+            <w:proofErr w:type="spellEnd"/>
+            <w:r>
+              <w:rPr>
+                <w:highlight w:val="magenta"/>
+                <w:lang w:val="en-US"/>
+              </w:rPr>
+              <w:t xml:space="preserve"> }}</w:t>
             </w:r>
           </w:p>
         </w:tc>
@@ -2346,12 +3269,14 @@
             <w:r>
               <w:t xml:space="preserve">Просто </w:t>
             </w:r>
+            <w:proofErr w:type="spellStart"/>
             <w:r>
               <w:rPr>
                 <w:lang w:val="en-US"/>
               </w:rPr>
               <w:t>Tk</w:t>
             </w:r>
+            <w:proofErr w:type="spellEnd"/>
             <w:r>
               <w:t>.</w:t>
             </w:r>
@@ -2371,7 +3296,7 @@
 </file>
 
 <file path=word/styles.xml><?xml version="1.0" encoding="utf-8"?>
-<w:styles xmlns:mc="http://schemas.openxmlformats.org/markup-compatibility/2006" xmlns:r="http://schemas.openxmlformats.org/officeDocument/2006/relationships" xmlns:w="http://schemas.openxmlformats.org/wordprocessingml/2006/main" xmlns:w14="http://schemas.microsoft.com/office/word/2010/wordml" xmlns:w15="http://schemas.microsoft.com/office/word/2012/wordml" xmlns:w16cex="http://schemas.microsoft.com/office/word/2018/wordml/cex" xmlns:w16cid="http://schemas.microsoft.com/office/word/2016/wordml/cid" xmlns:w16="http://schemas.microsoft.com/office/word/2018/wordml" xmlns:w16se="http://schemas.microsoft.com/office/word/2015/wordml/symex" mc:Ignorable="w14 w15 w16se w16cid w16 w16cex">
+<w:styles xmlns:mc="http://schemas.openxmlformats.org/markup-compatibility/2006" xmlns:r="http://schemas.openxmlformats.org/officeDocument/2006/relationships" xmlns:w="http://schemas.openxmlformats.org/wordprocessingml/2006/main" xmlns:w14="http://schemas.microsoft.com/office/word/2010/wordml" xmlns:w15="http://schemas.microsoft.com/office/word/2012/wordml" xmlns:w16se="http://schemas.microsoft.com/office/word/2015/wordml/symex" mc:Ignorable="w14 w15 w16se">
   <w:docDefaults>
     <w:rPrDefault>
       <w:rPr>
@@ -2381,7 +3306,7 @@
     </w:rPrDefault>
     <w:pPrDefault/>
   </w:docDefaults>
-  <w:latentStyles w:defLockedState="0" w:defUIPriority="99" w:defSemiHidden="0" w:defUnhideWhenUsed="0" w:defQFormat="0" w:count="376">
+  <w:latentStyles w:defLockedState="0" w:defUIPriority="99" w:defSemiHidden="0" w:defUnhideWhenUsed="0" w:defQFormat="0" w:count="371">
     <w:lsdException w:name="Normal" w:uiPriority="0" w:qFormat="1"/>
     <w:lsdException w:name="heading 1" w:uiPriority="0" w:qFormat="1"/>
     <w:lsdException w:name="heading 2" w:semiHidden="1" w:uiPriority="0" w:unhideWhenUsed="1" w:qFormat="1"/>
@@ -2753,11 +3678,6 @@
     <w:lsdException w:name="List Table 5 Dark Accent 6" w:uiPriority="50"/>
     <w:lsdException w:name="List Table 6 Colorful Accent 6" w:uiPriority="51"/>
     <w:lsdException w:name="List Table 7 Colorful Accent 6" w:uiPriority="52"/>
-    <w:lsdException w:name="Mention" w:semiHidden="1" w:unhideWhenUsed="1"/>
-    <w:lsdException w:name="Smart Hyperlink" w:semiHidden="1" w:unhideWhenUsed="1"/>
-    <w:lsdException w:name="Hashtag" w:semiHidden="1" w:unhideWhenUsed="1"/>
-    <w:lsdException w:name="Unresolved Mention" w:semiHidden="1" w:unhideWhenUsed="1"/>
-    <w:lsdException w:name="Smart Link" w:semiHidden="1" w:unhideWhenUsed="1"/>
   </w:latentStyles>
   <w:style w:type="paragraph" w:default="1" w:styleId="a">
     <w:name w:val="Normal"/>

</xml_diff>